<commit_message>
Safety report completed. Got Prof. Schreve's signature, need Zapke's signature and Zietsman
</commit_message>
<xml_diff>
--- a/General Safety Induction/2023_StructuresLab_Safety_Template_final.docx
+++ b/General Safety Induction/2023_StructuresLab_Safety_Template_final.docx
@@ -820,8 +820,18 @@
                                       <w:sz w:val="24"/>
                                       <w:szCs w:val="24"/>
                                     </w:rPr>
-                                    <w:t xml:space="preserve"> Zietsman</w:t>
+                                    <w:t xml:space="preserve"> </w:t>
                                   </w:r>
+                                  <w:proofErr w:type="spellStart"/>
+                                  <w:r>
+                                    <w:rPr>
+                                      <w:rFonts w:ascii="Arial" w:eastAsia="Arial" w:hAnsi="Arial"/>
+                                      <w:sz w:val="24"/>
+                                      <w:szCs w:val="24"/>
+                                    </w:rPr>
+                                    <w:t>Zietsman</w:t>
+                                  </w:r>
+                                  <w:proofErr w:type="spellEnd"/>
                                   <w:r>
                                     <w:rPr>
                                       <w:rFonts w:ascii="Arial" w:eastAsia="Arial" w:hAnsi="Arial"/>
@@ -1728,7 +1738,25 @@
                                 <w:sz w:val="18"/>
                                 <w:szCs w:val="18"/>
                               </w:rPr>
-                              <w:t>No pressure vessels or pipes with pressure in excess of 50kPa are involved in this project</w:t>
+                              <w:t xml:space="preserve">No pressure vessels or pipes with pressure </w:t>
+                            </w:r>
+                            <w:proofErr w:type="gramStart"/>
+                            <w:r>
+                              <w:rPr>
+                                <w:rFonts w:ascii="Arial" w:hAnsi="Arial"/>
+                                <w:sz w:val="18"/>
+                                <w:szCs w:val="18"/>
+                              </w:rPr>
+                              <w:t>in excess of</w:t>
+                            </w:r>
+                            <w:proofErr w:type="gramEnd"/>
+                            <w:r>
+                              <w:rPr>
+                                <w:rFonts w:ascii="Arial" w:hAnsi="Arial"/>
+                                <w:sz w:val="18"/>
+                                <w:szCs w:val="18"/>
+                              </w:rPr>
+                              <w:t xml:space="preserve"> 50kPa are involved in this project</w:t>
                             </w:r>
                             <w:r>
                               <w:rPr>
@@ -1794,8 +1822,18 @@
                                 <w:sz w:val="18"/>
                                 <w:szCs w:val="18"/>
                               </w:rPr>
-                              <w:t>vessels or pipes in excess of</w:t>
+                              <w:t xml:space="preserve">vessels or pipes </w:t>
                             </w:r>
+                            <w:proofErr w:type="gramStart"/>
+                            <w:r>
+                              <w:rPr>
+                                <w:rFonts w:ascii="Arial" w:hAnsi="Arial"/>
+                                <w:sz w:val="18"/>
+                                <w:szCs w:val="18"/>
+                              </w:rPr>
+                              <w:t>in excess of</w:t>
+                            </w:r>
+                            <w:proofErr w:type="gramEnd"/>
                             <w:r>
                               <w:rPr>
                                 <w:rFonts w:ascii="Arial" w:hAnsi="Arial"/>
@@ -2842,8 +2880,18 @@
                                 <w:sz w:val="24"/>
                                 <w:szCs w:val="24"/>
                               </w:rPr>
-                              <w:t xml:space="preserve"> Zietsman</w:t>
+                              <w:t xml:space="preserve"> </w:t>
                             </w:r>
+                            <w:proofErr w:type="spellStart"/>
+                            <w:r>
+                              <w:rPr>
+                                <w:rFonts w:ascii="Arial" w:eastAsia="Arial" w:hAnsi="Arial"/>
+                                <w:sz w:val="24"/>
+                                <w:szCs w:val="24"/>
+                              </w:rPr>
+                              <w:t>Zietsman</w:t>
+                            </w:r>
+                            <w:proofErr w:type="spellEnd"/>
                             <w:r>
                               <w:rPr>
                                 <w:rFonts w:ascii="Arial" w:eastAsia="Arial" w:hAnsi="Arial"/>
@@ -3750,7 +3798,25 @@
                           <w:sz w:val="18"/>
                           <w:szCs w:val="18"/>
                         </w:rPr>
-                        <w:t>No pressure vessels or pipes with pressure in excess of 50kPa are involved in this project</w:t>
+                        <w:t xml:space="preserve">No pressure vessels or pipes with pressure </w:t>
+                      </w:r>
+                      <w:proofErr w:type="gramStart"/>
+                      <w:r>
+                        <w:rPr>
+                          <w:rFonts w:ascii="Arial" w:hAnsi="Arial"/>
+                          <w:sz w:val="18"/>
+                          <w:szCs w:val="18"/>
+                        </w:rPr>
+                        <w:t>in excess of</w:t>
+                      </w:r>
+                      <w:proofErr w:type="gramEnd"/>
+                      <w:r>
+                        <w:rPr>
+                          <w:rFonts w:ascii="Arial" w:hAnsi="Arial"/>
+                          <w:sz w:val="18"/>
+                          <w:szCs w:val="18"/>
+                        </w:rPr>
+                        <w:t xml:space="preserve"> 50kPa are involved in this project</w:t>
                       </w:r>
                       <w:r>
                         <w:rPr>
@@ -3816,8 +3882,18 @@
                           <w:sz w:val="18"/>
                           <w:szCs w:val="18"/>
                         </w:rPr>
-                        <w:t>vessels or pipes in excess of</w:t>
+                        <w:t xml:space="preserve">vessels or pipes </w:t>
                       </w:r>
+                      <w:proofErr w:type="gramStart"/>
+                      <w:r>
+                        <w:rPr>
+                          <w:rFonts w:ascii="Arial" w:hAnsi="Arial"/>
+                          <w:sz w:val="18"/>
+                          <w:szCs w:val="18"/>
+                        </w:rPr>
+                        <w:t>in excess of</w:t>
+                      </w:r>
+                      <w:proofErr w:type="gramEnd"/>
                       <w:r>
                         <w:rPr>
                           <w:rFonts w:ascii="Arial" w:hAnsi="Arial"/>
@@ -4111,6 +4187,7 @@
           <w:sz w:val="28"/>
           <w:szCs w:val="16"/>
         </w:rPr>
+        <w:lastRenderedPageBreak/>
         <w:t>Overview of Testing</w:t>
       </w:r>
     </w:p>
@@ -5895,7 +5972,25 @@
                 <w:sz w:val="22"/>
                 <w:szCs w:val="22"/>
               </w:rPr>
-              <w:t>HBM QuantumX (801433534)</w:t>
+              <w:t xml:space="preserve">HBM </w:t>
+            </w:r>
+            <w:proofErr w:type="spellStart"/>
+            <w:r>
+              <w:rPr>
+                <w:rFonts w:ascii="Arial" w:eastAsia="Arial" w:hAnsi="Arial"/>
+                <w:sz w:val="22"/>
+                <w:szCs w:val="22"/>
+              </w:rPr>
+              <w:t>QuantumX</w:t>
+            </w:r>
+            <w:proofErr w:type="spellEnd"/>
+            <w:r>
+              <w:rPr>
+                <w:rFonts w:ascii="Arial" w:eastAsia="Arial" w:hAnsi="Arial"/>
+                <w:sz w:val="22"/>
+                <w:szCs w:val="22"/>
+              </w:rPr>
+              <w:t xml:space="preserve"> (801433534)</w:t>
             </w:r>
           </w:p>
         </w:tc>
@@ -6769,6 +6864,173 @@
           <w:rFonts w:ascii="Arial" w:eastAsia="Arial" w:hAnsi="Arial" w:cs="Arial"/>
           <w:b/>
           <w:bCs/>
+          <w:color w:val="auto"/>
+        </w:rPr>
+      </w:pPr>
+      <w:r>
+        <w:rPr>
+          <w:rFonts w:ascii="Arial" w:eastAsia="Arial" w:hAnsi="Arial" w:cs="Arial"/>
+          <w:b/>
+          <w:bCs/>
+          <w:color w:val="auto"/>
+        </w:rPr>
+        <w:lastRenderedPageBreak/>
+        <w:t>S</w:t>
+      </w:r>
+      <w:r>
+        <w:rPr>
+          <w:rFonts w:ascii="Arial" w:eastAsia="Arial" w:hAnsi="Arial" w:cs="Arial"/>
+          <w:b/>
+          <w:bCs/>
+          <w:color w:val="auto"/>
+        </w:rPr>
+        <w:t>olenoid Preparation</w:t>
+      </w:r>
+    </w:p>
+    <w:p>
+      <w:pPr>
+        <w:pStyle w:val="ListParagraph"/>
+        <w:numPr>
+          <w:ilvl w:val="0"/>
+          <w:numId w:val="16"/>
+        </w:numPr>
+        <w:rPr>
+          <w:rFonts w:ascii="Arial" w:hAnsi="Arial"/>
+          <w:sz w:val="22"/>
+          <w:szCs w:val="22"/>
+        </w:rPr>
+      </w:pPr>
+      <w:r>
+        <w:rPr>
+          <w:rFonts w:ascii="Arial" w:hAnsi="Arial"/>
+          <w:sz w:val="22"/>
+          <w:szCs w:val="22"/>
+        </w:rPr>
+        <w:t xml:space="preserve">Apply </w:t>
+      </w:r>
+      <w:r>
+        <w:rPr>
+          <w:rFonts w:ascii="Arial" w:hAnsi="Arial"/>
+          <w:sz w:val="22"/>
+          <w:szCs w:val="22"/>
+        </w:rPr>
+        <w:t>a thin layer of high-temperature Kapton tape directly over the bare metal core to insulate it.</w:t>
+      </w:r>
+    </w:p>
+    <w:p>
+      <w:pPr>
+        <w:pStyle w:val="ListParagraph"/>
+        <w:numPr>
+          <w:ilvl w:val="0"/>
+          <w:numId w:val="16"/>
+        </w:numPr>
+        <w:rPr>
+          <w:rFonts w:ascii="Arial" w:hAnsi="Arial"/>
+          <w:sz w:val="22"/>
+          <w:szCs w:val="22"/>
+        </w:rPr>
+      </w:pPr>
+      <w:r>
+        <w:rPr>
+          <w:rFonts w:ascii="Arial" w:hAnsi="Arial"/>
+          <w:sz w:val="22"/>
+          <w:szCs w:val="22"/>
+        </w:rPr>
+        <w:t xml:space="preserve">Verify that the </w:t>
+      </w:r>
+      <w:r>
+        <w:rPr>
+          <w:rFonts w:ascii="Arial" w:hAnsi="Arial"/>
+          <w:sz w:val="22"/>
+          <w:szCs w:val="22"/>
+        </w:rPr>
+        <w:t>copper wire is free of kinks or breaks.</w:t>
+      </w:r>
+    </w:p>
+    <w:p>
+      <w:pPr>
+        <w:pStyle w:val="ListParagraph"/>
+        <w:numPr>
+          <w:ilvl w:val="0"/>
+          <w:numId w:val="16"/>
+        </w:numPr>
+        <w:rPr>
+          <w:rFonts w:ascii="Arial" w:hAnsi="Arial"/>
+          <w:sz w:val="22"/>
+          <w:szCs w:val="22"/>
+        </w:rPr>
+      </w:pPr>
+      <w:r>
+        <w:rPr>
+          <w:rFonts w:ascii="Arial" w:hAnsi="Arial"/>
+          <w:sz w:val="22"/>
+          <w:szCs w:val="22"/>
+        </w:rPr>
+        <w:t xml:space="preserve">Carefully wind the copper wire </w:t>
+      </w:r>
+      <w:r>
+        <w:rPr>
+          <w:rFonts w:ascii="Arial" w:hAnsi="Arial"/>
+          <w:sz w:val="22"/>
+          <w:szCs w:val="22"/>
+        </w:rPr>
+        <w:t>directly onto the insulated core, ensuring tight, uniform layers.</w:t>
+      </w:r>
+    </w:p>
+    <w:p>
+      <w:pPr>
+        <w:pStyle w:val="ListParagraph"/>
+        <w:numPr>
+          <w:ilvl w:val="0"/>
+          <w:numId w:val="16"/>
+        </w:numPr>
+        <w:rPr>
+          <w:rFonts w:ascii="Arial" w:hAnsi="Arial"/>
+          <w:sz w:val="22"/>
+          <w:szCs w:val="22"/>
+        </w:rPr>
+      </w:pPr>
+      <w:r>
+        <w:rPr>
+          <w:rFonts w:ascii="Arial" w:hAnsi="Arial"/>
+          <w:sz w:val="22"/>
+          <w:szCs w:val="22"/>
+        </w:rPr>
+        <w:t xml:space="preserve">Strip the enamel coating from the ends of the wire leads using fine sandpaper and </w:t>
+      </w:r>
+      <w:r>
+        <w:rPr>
+          <w:rFonts w:ascii="Arial" w:hAnsi="Arial"/>
+          <w:sz w:val="22"/>
+          <w:szCs w:val="22"/>
+        </w:rPr>
+        <w:t xml:space="preserve">insert the completed coils into the </w:t>
+      </w:r>
+      <w:r>
+        <w:rPr>
+          <w:rFonts w:ascii="Arial" w:hAnsi="Arial"/>
+          <w:sz w:val="22"/>
+          <w:szCs w:val="22"/>
+        </w:rPr>
+        <w:t>custom electromagnet housing.</w:t>
+      </w:r>
+    </w:p>
+    <w:p>
+      <w:pPr>
+        <w:rPr>
+          <w:rFonts w:ascii="Arial" w:hAnsi="Arial"/>
+          <w:sz w:val="22"/>
+          <w:szCs w:val="22"/>
+        </w:rPr>
+      </w:pPr>
+    </w:p>
+    <w:p>
+      <w:pPr>
+        <w:pStyle w:val="Heading2"/>
+        <w:rPr>
+          <w:rFonts w:ascii="Arial" w:eastAsia="Arial" w:hAnsi="Arial" w:cs="Arial"/>
+          <w:b/>
+          <w:bCs/>
           <w:color w:val="000000" w:themeColor="text1"/>
         </w:rPr>
       </w:pPr>
@@ -6855,14 +7117,21 @@
         </w:rPr>
         <w:t>.</w:t>
       </w:r>
-      <w:r>
-        <w:rPr>
-          <w:rFonts w:ascii="Arial" w:eastAsia="Arial" w:hAnsi="Arial"/>
-          <w:sz w:val="22"/>
-          <w:szCs w:val="22"/>
-        </w:rPr>
-        <w:t xml:space="preserve"> </w:t>
-      </w:r>
+    </w:p>
+    <w:p>
+      <w:pPr>
+        <w:pStyle w:val="ListParagraph"/>
+        <w:numPr>
+          <w:ilvl w:val="0"/>
+          <w:numId w:val="7"/>
+        </w:numPr>
+        <w:spacing w:line="0" w:lineRule="atLeast"/>
+        <w:rPr>
+          <w:rFonts w:ascii="Arial" w:eastAsia="Arial" w:hAnsi="Arial"/>
+          <w:sz w:val="22"/>
+          <w:szCs w:val="22"/>
+        </w:rPr>
+      </w:pPr>
       <w:r>
         <w:rPr>
           <w:rFonts w:ascii="Arial" w:eastAsia="Arial" w:hAnsi="Arial"/>
@@ -6885,7 +7154,23 @@
           <w:sz w:val="22"/>
           <w:szCs w:val="22"/>
         </w:rPr>
-        <w:t>the circuit</w:t>
+        <w:t xml:space="preserve">the </w:t>
+      </w:r>
+      <w:r>
+        <w:rPr>
+          <w:rFonts w:ascii="Arial" w:eastAsia="Arial" w:hAnsi="Arial"/>
+          <w:sz w:val="22"/>
+          <w:szCs w:val="22"/>
+        </w:rPr>
+        <w:t xml:space="preserve">switching </w:t>
+      </w:r>
+      <w:r>
+        <w:rPr>
+          <w:rFonts w:ascii="Arial" w:eastAsia="Arial" w:hAnsi="Arial"/>
+          <w:sz w:val="22"/>
+          <w:szCs w:val="22"/>
+        </w:rPr>
+        <w:t>circuit</w:t>
       </w:r>
       <w:r>
         <w:rPr>
@@ -6894,6 +7179,53 @@
           <w:szCs w:val="22"/>
         </w:rPr>
         <w:t xml:space="preserve"> to the fabricated electromagnet.</w:t>
+      </w:r>
+    </w:p>
+    <w:p>
+      <w:pPr>
+        <w:pStyle w:val="ListParagraph"/>
+        <w:numPr>
+          <w:ilvl w:val="0"/>
+          <w:numId w:val="7"/>
+        </w:numPr>
+        <w:spacing w:line="0" w:lineRule="atLeast"/>
+        <w:rPr>
+          <w:rFonts w:ascii="Arial" w:eastAsia="Arial" w:hAnsi="Arial"/>
+          <w:sz w:val="22"/>
+          <w:szCs w:val="22"/>
+        </w:rPr>
+      </w:pPr>
+      <w:r>
+        <w:rPr>
+          <w:rFonts w:ascii="Arial" w:eastAsia="Arial" w:hAnsi="Arial"/>
+          <w:sz w:val="22"/>
+          <w:szCs w:val="22"/>
+        </w:rPr>
+        <w:t xml:space="preserve">Secure the </w:t>
+      </w:r>
+      <w:r>
+        <w:rPr>
+          <w:rFonts w:ascii="Arial" w:eastAsia="Arial" w:hAnsi="Arial"/>
+          <w:sz w:val="22"/>
+          <w:szCs w:val="22"/>
+        </w:rPr>
+        <w:t>electromagnet using non-magnetic metal blocks</w:t>
+      </w:r>
+      <w:r>
+        <w:rPr>
+          <w:rFonts w:ascii="Arial" w:eastAsia="Arial" w:hAnsi="Arial"/>
+          <w:sz w:val="22"/>
+          <w:szCs w:val="22"/>
+        </w:rPr>
+        <w:t xml:space="preserve"> clamped against the workstation surface </w:t>
+      </w:r>
+      <w:r>
+        <w:rPr>
+          <w:rFonts w:ascii="Arial" w:eastAsia="Arial" w:hAnsi="Arial"/>
+          <w:sz w:val="22"/>
+          <w:szCs w:val="22"/>
+        </w:rPr>
+        <w:t>to prevent the rolling and movement during testing.</w:t>
       </w:r>
     </w:p>
     <w:p>
@@ -6926,16 +7258,7 @@
         <w:t>Safety Checks</w:t>
       </w:r>
     </w:p>
-    <w:p>
-      <w:pPr>
-        <w:spacing w:line="0" w:lineRule="atLeast"/>
-        <w:rPr>
-          <w:rFonts w:ascii="Arial" w:eastAsia="Arial" w:hAnsi="Arial"/>
-          <w:sz w:val="22"/>
-          <w:szCs w:val="22"/>
-        </w:rPr>
-      </w:pPr>
-    </w:p>
+    <w:p/>
     <w:p>
       <w:pPr>
         <w:pStyle w:val="ListParagraph"/>
@@ -6956,23 +7279,141 @@
           <w:sz w:val="22"/>
           <w:szCs w:val="22"/>
         </w:rPr>
-        <w:t xml:space="preserve">Verify the functionality of the emergency stop button by engaging it before </w:t>
-      </w:r>
-      <w:r>
-        <w:rPr>
-          <w:rFonts w:ascii="Arial" w:eastAsia="Arial" w:hAnsi="Arial"/>
-          <w:sz w:val="22"/>
-          <w:szCs w:val="22"/>
-        </w:rPr>
-        <w:t xml:space="preserve">running </w:t>
-      </w:r>
-      <w:r>
-        <w:rPr>
-          <w:rFonts w:ascii="Arial" w:eastAsia="Arial" w:hAnsi="Arial"/>
-          <w:sz w:val="22"/>
-          <w:szCs w:val="22"/>
-        </w:rPr>
-        <w:t>full power through the electromagnet</w:t>
+        <w:t xml:space="preserve">Ensure all safety warnings, as shown in Figure </w:t>
+      </w:r>
+      <w:r>
+        <w:rPr>
+          <w:rFonts w:ascii="Arial" w:eastAsia="Arial" w:hAnsi="Arial"/>
+          <w:sz w:val="22"/>
+          <w:szCs w:val="22"/>
+        </w:rPr>
+        <w:t>2</w:t>
+      </w:r>
+      <w:r>
+        <w:rPr>
+          <w:rFonts w:ascii="Arial" w:eastAsia="Arial" w:hAnsi="Arial"/>
+          <w:sz w:val="22"/>
+          <w:szCs w:val="22"/>
+        </w:rPr>
+        <w:t>,</w:t>
+      </w:r>
+      <w:r>
+        <w:rPr>
+          <w:rFonts w:ascii="Arial" w:eastAsia="Arial" w:hAnsi="Arial"/>
+          <w:sz w:val="22"/>
+          <w:szCs w:val="22"/>
+        </w:rPr>
+        <w:t xml:space="preserve"> are clearly</w:t>
+      </w:r>
+      <w:r>
+        <w:rPr>
+          <w:rFonts w:ascii="Arial" w:eastAsia="Arial" w:hAnsi="Arial"/>
+          <w:sz w:val="22"/>
+          <w:szCs w:val="22"/>
+        </w:rPr>
+        <w:t xml:space="preserve"> visible.</w:t>
+      </w:r>
+    </w:p>
+    <w:p>
+      <w:pPr>
+        <w:pStyle w:val="ListParagraph"/>
+        <w:numPr>
+          <w:ilvl w:val="0"/>
+          <w:numId w:val="12"/>
+        </w:numPr>
+        <w:spacing w:line="0" w:lineRule="atLeast"/>
+        <w:rPr>
+          <w:rFonts w:ascii="Arial" w:eastAsia="Arial" w:hAnsi="Arial"/>
+          <w:sz w:val="22"/>
+          <w:szCs w:val="22"/>
+        </w:rPr>
+      </w:pPr>
+      <w:r>
+        <w:rPr>
+          <w:rFonts w:ascii="Arial" w:eastAsia="Arial" w:hAnsi="Arial"/>
+          <w:sz w:val="22"/>
+          <w:szCs w:val="22"/>
+        </w:rPr>
+        <w:t xml:space="preserve">Make sure the </w:t>
+      </w:r>
+      <w:r>
+        <w:rPr>
+          <w:rFonts w:ascii="Arial" w:eastAsia="Arial" w:hAnsi="Arial"/>
+          <w:sz w:val="22"/>
+          <w:szCs w:val="22"/>
+        </w:rPr>
+        <w:t xml:space="preserve">blocks are properly secured before placing the electromagnet </w:t>
+      </w:r>
+      <w:r>
+        <w:rPr>
+          <w:rFonts w:ascii="Arial" w:eastAsia="Arial" w:hAnsi="Arial"/>
+          <w:sz w:val="22"/>
+          <w:szCs w:val="22"/>
+        </w:rPr>
+        <w:t>to prevent accidental slipping.</w:t>
+      </w:r>
+    </w:p>
+    <w:p>
+      <w:pPr>
+        <w:pStyle w:val="ListParagraph"/>
+        <w:numPr>
+          <w:ilvl w:val="0"/>
+          <w:numId w:val="12"/>
+        </w:numPr>
+        <w:spacing w:line="0" w:lineRule="atLeast"/>
+        <w:rPr>
+          <w:rFonts w:ascii="Arial" w:eastAsia="Arial" w:hAnsi="Arial"/>
+          <w:sz w:val="22"/>
+          <w:szCs w:val="22"/>
+        </w:rPr>
+      </w:pPr>
+      <w:r>
+        <w:rPr>
+          <w:rFonts w:ascii="Arial" w:eastAsia="Arial" w:hAnsi="Arial"/>
+          <w:sz w:val="22"/>
+          <w:szCs w:val="22"/>
+        </w:rPr>
+        <w:t>Ensure all switching circuit connections are insulated</w:t>
+      </w:r>
+      <w:r>
+        <w:rPr>
+          <w:rFonts w:ascii="Arial" w:eastAsia="Arial" w:hAnsi="Arial"/>
+          <w:sz w:val="22"/>
+          <w:szCs w:val="22"/>
+        </w:rPr>
+        <w:t xml:space="preserve"> before </w:t>
+      </w:r>
+      <w:r>
+        <w:rPr>
+          <w:rFonts w:ascii="Arial" w:eastAsia="Arial" w:hAnsi="Arial"/>
+          <w:sz w:val="22"/>
+          <w:szCs w:val="22"/>
+        </w:rPr>
+        <w:t>connecting</w:t>
+      </w:r>
+      <w:r>
+        <w:rPr>
+          <w:rFonts w:ascii="Arial" w:eastAsia="Arial" w:hAnsi="Arial"/>
+          <w:sz w:val="22"/>
+          <w:szCs w:val="22"/>
+        </w:rPr>
+        <w:t xml:space="preserve"> </w:t>
+      </w:r>
+      <w:r>
+        <w:rPr>
+          <w:rFonts w:ascii="Arial" w:eastAsia="Arial" w:hAnsi="Arial"/>
+          <w:sz w:val="22"/>
+          <w:szCs w:val="22"/>
+        </w:rPr>
+        <w:t>the switching circuit</w:t>
+      </w:r>
+      <w:r>
+        <w:rPr>
+          <w:rFonts w:ascii="Arial" w:eastAsia="Arial" w:hAnsi="Arial"/>
+          <w:sz w:val="22"/>
+          <w:szCs w:val="22"/>
+        </w:rPr>
+        <w:t xml:space="preserve"> to the power supply</w:t>
       </w:r>
       <w:r>
         <w:rPr>
@@ -6981,6 +7422,68 @@
           <w:szCs w:val="22"/>
         </w:rPr>
         <w:t>.</w:t>
+      </w:r>
+    </w:p>
+    <w:p>
+      <w:pPr>
+        <w:pStyle w:val="ListParagraph"/>
+        <w:numPr>
+          <w:ilvl w:val="0"/>
+          <w:numId w:val="12"/>
+        </w:numPr>
+        <w:spacing w:line="0" w:lineRule="atLeast"/>
+        <w:rPr>
+          <w:rFonts w:ascii="Arial" w:eastAsia="Arial" w:hAnsi="Arial"/>
+          <w:sz w:val="22"/>
+          <w:szCs w:val="22"/>
+        </w:rPr>
+      </w:pPr>
+      <w:r>
+        <w:rPr>
+          <w:rFonts w:ascii="Arial" w:eastAsia="Arial" w:hAnsi="Arial"/>
+          <w:sz w:val="22"/>
+          <w:szCs w:val="22"/>
+        </w:rPr>
+        <w:t>Verify the functionality of the emergency stop button by engaging it before running full power through the electromagnet.</w:t>
+      </w:r>
+    </w:p>
+    <w:p>
+      <w:pPr>
+        <w:pStyle w:val="ListParagraph"/>
+        <w:numPr>
+          <w:ilvl w:val="0"/>
+          <w:numId w:val="12"/>
+        </w:numPr>
+        <w:spacing w:line="0" w:lineRule="atLeast"/>
+        <w:rPr>
+          <w:rFonts w:ascii="Arial" w:eastAsia="Arial" w:hAnsi="Arial"/>
+          <w:sz w:val="22"/>
+          <w:szCs w:val="22"/>
+        </w:rPr>
+      </w:pPr>
+      <w:r>
+        <w:rPr>
+          <w:rFonts w:ascii="Arial" w:eastAsia="Arial" w:hAnsi="Arial"/>
+          <w:sz w:val="22"/>
+          <w:szCs w:val="22"/>
+        </w:rPr>
+        <w:t xml:space="preserve">Check for any nearby objects that may be affected by the electromagnetic </w:t>
+      </w:r>
+      <w:r>
+        <w:rPr>
+          <w:rFonts w:ascii="Arial" w:eastAsia="Arial" w:hAnsi="Arial"/>
+          <w:sz w:val="22"/>
+          <w:szCs w:val="22"/>
+        </w:rPr>
+        <w:t>field before engaging the electromagnet</w:t>
+      </w:r>
+      <w:r>
+        <w:rPr>
+          <w:rFonts w:ascii="Arial" w:eastAsia="Arial" w:hAnsi="Arial"/>
+          <w:sz w:val="22"/>
+          <w:szCs w:val="22"/>
+        </w:rPr>
+        <w:t xml:space="preserve"> at full power.</w:t>
       </w:r>
     </w:p>
     <w:p>
@@ -7431,6 +7934,127 @@
           <w:szCs w:val="22"/>
         </w:rPr>
         <w:t>over the soldering connections.</w:t>
+      </w:r>
+    </w:p>
+    <w:p>
+      <w:pPr>
+        <w:spacing w:line="0" w:lineRule="atLeast"/>
+        <w:rPr>
+          <w:rFonts w:ascii="Arial" w:eastAsia="Arial" w:hAnsi="Arial"/>
+          <w:sz w:val="22"/>
+          <w:szCs w:val="22"/>
+        </w:rPr>
+      </w:pPr>
+      <w:r>
+        <w:rPr>
+          <w:noProof/>
+        </w:rPr>
+        <w:lastRenderedPageBreak/>
+        <w:drawing>
+          <wp:inline distT="0" distB="0" distL="0" distR="0" wp14:anchorId="503C51BD" wp14:editId="4A878099">
+            <wp:extent cx="5731510" cy="2752725"/>
+            <wp:effectExtent l="0" t="0" r="2540" b="9525"/>
+            <wp:docPr id="1628830858" name="Picture 9"/>
+            <wp:cNvGraphicFramePr>
+              <a:graphicFrameLocks xmlns:a="http://schemas.openxmlformats.org/drawingml/2006/main" noChangeAspect="1"/>
+            </wp:cNvGraphicFramePr>
+            <a:graphic xmlns:a="http://schemas.openxmlformats.org/drawingml/2006/main">
+              <a:graphicData uri="http://schemas.openxmlformats.org/drawingml/2006/picture">
+                <pic:pic xmlns:pic="http://schemas.openxmlformats.org/drawingml/2006/picture">
+                  <pic:nvPicPr>
+                    <pic:cNvPr id="0" name="Picture 1"/>
+                    <pic:cNvPicPr>
+                      <a:picLocks noChangeAspect="1" noChangeArrowheads="1"/>
+                    </pic:cNvPicPr>
+                  </pic:nvPicPr>
+                  <pic:blipFill>
+                    <a:blip r:embed="rId11" cstate="print">
+                      <a:extLst>
+                        <a:ext uri="{28A0092B-C50C-407E-A947-70E740481C1C}">
+                          <a14:useLocalDpi xmlns:a14="http://schemas.microsoft.com/office/drawing/2010/main" val="0"/>
+                        </a:ext>
+                      </a:extLst>
+                    </a:blip>
+                    <a:srcRect/>
+                    <a:stretch>
+                      <a:fillRect/>
+                    </a:stretch>
+                  </pic:blipFill>
+                  <pic:spPr bwMode="auto">
+                    <a:xfrm>
+                      <a:off x="0" y="0"/>
+                      <a:ext cx="5731510" cy="2752725"/>
+                    </a:xfrm>
+                    <a:prstGeom prst="rect">
+                      <a:avLst/>
+                    </a:prstGeom>
+                    <a:noFill/>
+                    <a:ln>
+                      <a:noFill/>
+                    </a:ln>
+                  </pic:spPr>
+                </pic:pic>
+              </a:graphicData>
+            </a:graphic>
+          </wp:inline>
+        </w:drawing>
+      </w:r>
+    </w:p>
+    <w:p>
+      <w:pPr>
+        <w:pStyle w:val="Caption"/>
+        <w:jc w:val="center"/>
+        <w:rPr>
+          <w:rFonts w:ascii="Arial" w:eastAsia="Arial" w:hAnsi="Arial"/>
+          <w:b/>
+          <w:bCs/>
+          <w:color w:val="auto"/>
+          <w:sz w:val="28"/>
+          <w:szCs w:val="28"/>
+        </w:rPr>
+      </w:pPr>
+      <w:r>
+        <w:rPr>
+          <w:color w:val="auto"/>
+        </w:rPr>
+        <w:t xml:space="preserve">Figure </w:t>
+      </w:r>
+      <w:r>
+        <w:rPr>
+          <w:color w:val="auto"/>
+        </w:rPr>
+        <w:fldChar w:fldCharType="begin"/>
+      </w:r>
+      <w:r>
+        <w:rPr>
+          <w:color w:val="auto"/>
+        </w:rPr>
+        <w:instrText xml:space="preserve"> SEQ Figure \* ARABIC </w:instrText>
+      </w:r>
+      <w:r>
+        <w:rPr>
+          <w:color w:val="auto"/>
+        </w:rPr>
+        <w:fldChar w:fldCharType="separate"/>
+      </w:r>
+      <w:r>
+        <w:rPr>
+          <w:noProof/>
+          <w:color w:val="auto"/>
+        </w:rPr>
+        <w:t>1</w:t>
+      </w:r>
+      <w:r>
+        <w:rPr>
+          <w:color w:val="auto"/>
+        </w:rPr>
+        <w:fldChar w:fldCharType="end"/>
+      </w:r>
+      <w:r>
+        <w:rPr>
+          <w:color w:val="auto"/>
+        </w:rPr>
+        <w:t>: Experimental Setup</w:t>
       </w:r>
     </w:p>
     <w:p>
@@ -7514,7 +8138,7 @@
                 <w:sz w:val="22"/>
                 <w:szCs w:val="22"/>
               </w:rPr>
-              <w:t>Student:</w:t>
+              <w:t>Supervisor:</w:t>
             </w:r>
           </w:p>
           <w:p>
@@ -7541,7 +8165,7 @@
                 <w:sz w:val="22"/>
                 <w:szCs w:val="22"/>
               </w:rPr>
-              <w:t>Lena Matota</w:t>
+              <w:t>Kristiaan Schreve</w:t>
             </w:r>
             <w:r>
               <w:rPr>
@@ -7557,7 +8181,7 @@
           <w:tcPr>
             <w:tcW w:w="4136" w:type="dxa"/>
             <w:tcBorders>
-              <w:top w:val="single" w:sz="4" w:space="0" w:color="FFFFFF" w:themeColor="background1"/>
+              <w:top w:val="nil"/>
               <w:left w:val="single" w:sz="4" w:space="0" w:color="FFFFFF" w:themeColor="background1"/>
               <w:right w:val="single" w:sz="4" w:space="0" w:color="FFFFFF" w:themeColor="background1"/>
             </w:tcBorders>
@@ -7602,7 +8226,7 @@
                 <w:sz w:val="22"/>
                 <w:szCs w:val="22"/>
               </w:rPr>
-              <w:t>Supervisor:</w:t>
+              <w:t>Lab Engineer:</w:t>
             </w:r>
           </w:p>
           <w:p>
@@ -7629,7 +8253,7 @@
                 <w:sz w:val="22"/>
                 <w:szCs w:val="22"/>
               </w:rPr>
-              <w:t>Kristiaan Schreve</w:t>
+              <w:t>Karl Zapke</w:t>
             </w:r>
             <w:r>
               <w:rPr>
@@ -7689,7 +8313,7 @@
                 <w:sz w:val="22"/>
                 <w:szCs w:val="22"/>
               </w:rPr>
-              <w:t>Lab Engineer:</w:t>
+              <w:t>Head of Safety:</w:t>
             </w:r>
           </w:p>
           <w:p>
@@ -7699,7 +8323,6 @@
                 <w:rFonts w:ascii="Arial" w:eastAsia="Arial" w:hAnsi="Arial"/>
                 <w:sz w:val="22"/>
                 <w:szCs w:val="22"/>
-                <w:u w:val="single"/>
               </w:rPr>
             </w:pPr>
             <w:r>
@@ -7708,23 +8331,7 @@
                 <w:sz w:val="22"/>
                 <w:szCs w:val="22"/>
               </w:rPr>
-              <w:t>(</w:t>
-            </w:r>
-            <w:r>
-              <w:rPr>
-                <w:rFonts w:ascii="Arial" w:eastAsia="Arial" w:hAnsi="Arial"/>
-                <w:sz w:val="22"/>
-                <w:szCs w:val="22"/>
-              </w:rPr>
-              <w:t>Karl Zapke</w:t>
-            </w:r>
-            <w:r>
-              <w:rPr>
-                <w:rFonts w:ascii="Arial" w:eastAsia="Arial" w:hAnsi="Arial"/>
-                <w:sz w:val="22"/>
-                <w:szCs w:val="22"/>
-              </w:rPr>
-              <w:t>)</w:t>
+              <w:t>(C Zietsman)</w:t>
             </w:r>
           </w:p>
         </w:tc>
@@ -7750,76 +8357,6 @@
           </w:p>
         </w:tc>
       </w:tr>
-      <w:tr>
-        <w:tc>
-          <w:tcPr>
-            <w:tcW w:w="3964" w:type="dxa"/>
-            <w:tcBorders>
-              <w:top w:val="single" w:sz="4" w:space="0" w:color="FFFFFF" w:themeColor="background1"/>
-              <w:left w:val="single" w:sz="4" w:space="0" w:color="FFFFFF" w:themeColor="background1"/>
-              <w:bottom w:val="single" w:sz="4" w:space="0" w:color="FFFFFF" w:themeColor="background1"/>
-              <w:right w:val="single" w:sz="4" w:space="0" w:color="FFFFFF" w:themeColor="background1"/>
-            </w:tcBorders>
-          </w:tcPr>
-          <w:p>
-            <w:pPr>
-              <w:spacing w:line="276" w:lineRule="auto"/>
-              <w:rPr>
-                <w:rFonts w:ascii="Arial" w:eastAsia="Arial" w:hAnsi="Arial"/>
-                <w:sz w:val="22"/>
-                <w:szCs w:val="22"/>
-              </w:rPr>
-            </w:pPr>
-            <w:r>
-              <w:rPr>
-                <w:rFonts w:ascii="Arial" w:eastAsia="Arial" w:hAnsi="Arial"/>
-                <w:sz w:val="22"/>
-                <w:szCs w:val="22"/>
-              </w:rPr>
-              <w:t>Head of Safety:</w:t>
-            </w:r>
-          </w:p>
-          <w:p>
-            <w:pPr>
-              <w:spacing w:line="276" w:lineRule="auto"/>
-              <w:rPr>
-                <w:rFonts w:ascii="Arial" w:eastAsia="Arial" w:hAnsi="Arial"/>
-                <w:sz w:val="22"/>
-                <w:szCs w:val="22"/>
-              </w:rPr>
-            </w:pPr>
-            <w:r>
-              <w:rPr>
-                <w:rFonts w:ascii="Arial" w:eastAsia="Arial" w:hAnsi="Arial"/>
-                <w:sz w:val="22"/>
-                <w:szCs w:val="22"/>
-              </w:rPr>
-              <w:t>(C Zietsman)</w:t>
-            </w:r>
-          </w:p>
-        </w:tc>
-        <w:tc>
-          <w:tcPr>
-            <w:tcW w:w="4136" w:type="dxa"/>
-            <w:tcBorders>
-              <w:left w:val="single" w:sz="4" w:space="0" w:color="FFFFFF" w:themeColor="background1"/>
-              <w:right w:val="single" w:sz="4" w:space="0" w:color="FFFFFF" w:themeColor="background1"/>
-            </w:tcBorders>
-          </w:tcPr>
-          <w:p>
-            <w:pPr>
-              <w:spacing w:line="0" w:lineRule="atLeast"/>
-              <w:jc w:val="center"/>
-              <w:rPr>
-                <w:rFonts w:ascii="Arial" w:eastAsia="Arial" w:hAnsi="Arial"/>
-                <w:sz w:val="24"/>
-                <w:szCs w:val="24"/>
-                <w:u w:val="single"/>
-              </w:rPr>
-            </w:pPr>
-          </w:p>
-        </w:tc>
-      </w:tr>
     </w:tbl>
     <w:p>
       <w:pPr>
@@ -7926,7 +8463,25 @@
           <w:sz w:val="22"/>
           <w:szCs w:val="22"/>
         </w:rPr>
-        <w:t>Connect the installed strain gauges to the HBM QuantumX DAQ.</w:t>
+        <w:t xml:space="preserve">Connect the installed strain gauges to the HBM </w:t>
+      </w:r>
+      <w:proofErr w:type="spellStart"/>
+      <w:r>
+        <w:rPr>
+          <w:rFonts w:ascii="Arial" w:eastAsia="Arial" w:hAnsi="Arial"/>
+          <w:sz w:val="22"/>
+          <w:szCs w:val="22"/>
+        </w:rPr>
+        <w:t>QuantumX</w:t>
+      </w:r>
+      <w:proofErr w:type="spellEnd"/>
+      <w:r>
+        <w:rPr>
+          <w:rFonts w:ascii="Arial" w:eastAsia="Arial" w:hAnsi="Arial"/>
+          <w:sz w:val="22"/>
+          <w:szCs w:val="22"/>
+        </w:rPr>
+        <w:t xml:space="preserve"> DAQ.</w:t>
       </w:r>
     </w:p>
     <w:p>
@@ -8039,6 +8594,17 @@
     </w:p>
     <w:p>
       <w:pPr>
+        <w:pStyle w:val="ListParagraph"/>
+        <w:spacing w:line="0" w:lineRule="atLeast"/>
+        <w:rPr>
+          <w:rFonts w:ascii="Arial" w:eastAsia="Arial" w:hAnsi="Arial"/>
+          <w:sz w:val="22"/>
+          <w:szCs w:val="22"/>
+        </w:rPr>
+      </w:pPr>
+    </w:p>
+    <w:p>
+      <w:pPr>
         <w:pStyle w:val="Heading2"/>
         <w:rPr>
           <w:rFonts w:ascii="Arial" w:eastAsia="Arial" w:hAnsi="Arial" w:cs="Arial"/>
@@ -8057,6 +8623,7 @@
         <w:t>Data Handling</w:t>
       </w:r>
     </w:p>
+    <w:p/>
     <w:p>
       <w:pPr>
         <w:pStyle w:val="ListParagraph"/>
@@ -8084,14 +8651,32 @@
           <w:sz w:val="22"/>
           <w:szCs w:val="22"/>
         </w:rPr>
-        <w:t xml:space="preserve"> and deflection data from the HBM QuantumX to </w:t>
-      </w:r>
+        <w:t xml:space="preserve"> and deflection data from the HBM </w:t>
+      </w:r>
+      <w:proofErr w:type="spellStart"/>
       <w:r>
         <w:rPr>
           <w:rFonts w:ascii="Arial" w:hAnsi="Arial"/>
           <w:sz w:val="22"/>
           <w:szCs w:val="22"/>
         </w:rPr>
+        <w:t>QuantumX</w:t>
+      </w:r>
+      <w:proofErr w:type="spellEnd"/>
+      <w:r>
+        <w:rPr>
+          <w:rFonts w:ascii="Arial" w:hAnsi="Arial"/>
+          <w:sz w:val="22"/>
+          <w:szCs w:val="22"/>
+        </w:rPr>
+        <w:t xml:space="preserve"> to </w:t>
+      </w:r>
+      <w:r>
+        <w:rPr>
+          <w:rFonts w:ascii="Arial" w:hAnsi="Arial"/>
+          <w:sz w:val="22"/>
+          <w:szCs w:val="22"/>
+        </w:rPr>
         <w:t xml:space="preserve">a </w:t>
       </w:r>
       <w:r>
@@ -8116,15 +8701,33 @@
           <w:sz w:val="22"/>
           <w:szCs w:val="22"/>
         </w:rPr>
-        <w:t>convention (e.g. “Sample#_Date</w:t>
-      </w:r>
+        <w:t>convention (e.g. “Sample#_</w:t>
+      </w:r>
+      <w:proofErr w:type="spellStart"/>
       <w:r>
         <w:rPr>
           <w:rFonts w:ascii="Arial" w:hAnsi="Arial"/>
           <w:sz w:val="22"/>
           <w:szCs w:val="22"/>
         </w:rPr>
-        <w:t>_Test#</w:t>
+        <w:t>Date</w:t>
+      </w:r>
+      <w:r>
+        <w:rPr>
+          <w:rFonts w:ascii="Arial" w:hAnsi="Arial"/>
+          <w:sz w:val="22"/>
+          <w:szCs w:val="22"/>
+        </w:rPr>
+        <w:t>_Test</w:t>
+      </w:r>
+      <w:proofErr w:type="spellEnd"/>
+      <w:r>
+        <w:rPr>
+          <w:rFonts w:ascii="Arial" w:hAnsi="Arial"/>
+          <w:sz w:val="22"/>
+          <w:szCs w:val="22"/>
+        </w:rPr>
+        <w:t>#</w:t>
       </w:r>
       <w:r>
         <w:rPr>
@@ -8283,6 +8886,7 @@
           <w:sz w:val="22"/>
           <w:szCs w:val="22"/>
         </w:rPr>
+        <w:lastRenderedPageBreak/>
         <w:t xml:space="preserve">Clean the workspace, returning all tools to their </w:t>
       </w:r>
       <w:r>
@@ -8416,7 +9020,7 @@
                           </pic:cNvPicPr>
                         </pic:nvPicPr>
                         <pic:blipFill rotWithShape="1">
-                          <a:blip r:embed="rId11">
+                          <a:blip r:embed="rId12">
                             <a:extLst>
                               <a:ext uri="{28A0092B-C50C-407E-A947-70E740481C1C}">
                                 <a14:useLocalDpi xmlns:a14="http://schemas.microsoft.com/office/drawing/2010/main" val="0"/>
@@ -8518,7 +9122,7 @@
                           </pic:cNvPicPr>
                         </pic:nvPicPr>
                         <pic:blipFill rotWithShape="1">
-                          <a:blip r:embed="rId12">
+                          <a:blip r:embed="rId13">
                             <a:extLst>
                               <a:ext uri="{28A0092B-C50C-407E-A947-70E740481C1C}">
                                 <a14:useLocalDpi xmlns:a14="http://schemas.microsoft.com/office/drawing/2010/main" val="0"/>
@@ -8618,7 +9222,7 @@
                           </pic:cNvPicPr>
                         </pic:nvPicPr>
                         <pic:blipFill rotWithShape="1">
-                          <a:blip r:embed="rId13">
+                          <a:blip r:embed="rId14">
                             <a:extLst>
                               <a:ext uri="{28A0092B-C50C-407E-A947-70E740481C1C}">
                                 <a14:useLocalDpi xmlns:a14="http://schemas.microsoft.com/office/drawing/2010/main" val="0"/>
@@ -8722,7 +9326,7 @@
                           </pic:cNvPicPr>
                         </pic:nvPicPr>
                         <pic:blipFill rotWithShape="1">
-                          <a:blip r:embed="rId14">
+                          <a:blip r:embed="rId15">
                             <a:extLst>
                               <a:ext uri="{28A0092B-C50C-407E-A947-70E740481C1C}">
                                 <a14:useLocalDpi xmlns:a14="http://schemas.microsoft.com/office/drawing/2010/main" val="0"/>
@@ -8829,7 +9433,7 @@
                           </pic:cNvPicPr>
                         </pic:nvPicPr>
                         <pic:blipFill rotWithShape="1">
-                          <a:blip r:embed="rId15">
+                          <a:blip r:embed="rId16">
                             <a:extLst>
                               <a:ext uri="{28A0092B-C50C-407E-A947-70E740481C1C}">
                                 <a14:useLocalDpi xmlns:a14="http://schemas.microsoft.com/office/drawing/2010/main" val="0"/>
@@ -9132,7 +9736,23 @@
           <w:sz w:val="22"/>
           <w:szCs w:val="22"/>
         </w:rPr>
-        <w:t xml:space="preserve">Closed shoes must be worn at all times. </w:t>
+        <w:t xml:space="preserve">Closed shoes must be </w:t>
+      </w:r>
+      <w:proofErr w:type="gramStart"/>
+      <w:r>
+        <w:rPr>
+          <w:sz w:val="22"/>
+          <w:szCs w:val="22"/>
+        </w:rPr>
+        <w:t>worn at all times</w:t>
+      </w:r>
+      <w:proofErr w:type="gramEnd"/>
+      <w:r>
+        <w:rPr>
+          <w:sz w:val="22"/>
+          <w:szCs w:val="22"/>
+        </w:rPr>
+        <w:t xml:space="preserve">. </w:t>
       </w:r>
     </w:p>
     <w:p>
@@ -9281,19 +9901,37 @@
           <w:szCs w:val="22"/>
         </w:rPr>
       </w:pPr>
-      <w:r>
-        <w:rPr>
-          <w:sz w:val="22"/>
-          <w:szCs w:val="22"/>
-        </w:rPr>
-        <w:t xml:space="preserve">Loose clothing may not be worn. </w:t>
-      </w:r>
-      <w:r>
-        <w:rPr>
-          <w:sz w:val="22"/>
-          <w:szCs w:val="22"/>
-        </w:rPr>
-        <w:t xml:space="preserve">Loose hair must be tied up. </w:t>
+      <w:proofErr w:type="gramStart"/>
+      <w:r>
+        <w:rPr>
+          <w:sz w:val="22"/>
+          <w:szCs w:val="22"/>
+        </w:rPr>
+        <w:t>Loose</w:t>
+      </w:r>
+      <w:proofErr w:type="gramEnd"/>
+      <w:r>
+        <w:rPr>
+          <w:sz w:val="22"/>
+          <w:szCs w:val="22"/>
+        </w:rPr>
+        <w:t xml:space="preserve"> clothing may not be worn. </w:t>
+      </w:r>
+      <w:proofErr w:type="gramStart"/>
+      <w:r>
+        <w:rPr>
+          <w:sz w:val="22"/>
+          <w:szCs w:val="22"/>
+        </w:rPr>
+        <w:t>Loose</w:t>
+      </w:r>
+      <w:proofErr w:type="gramEnd"/>
+      <w:r>
+        <w:rPr>
+          <w:sz w:val="22"/>
+          <w:szCs w:val="22"/>
+        </w:rPr>
+        <w:t xml:space="preserve"> hair must be tied up. </w:t>
       </w:r>
     </w:p>
     <w:p>
@@ -9335,7 +9973,15 @@
           <w:sz w:val="22"/>
           <w:szCs w:val="22"/>
         </w:rPr>
-        <w:t xml:space="preserve"> The lab should be completely clean, including all equipment stored away, after testing. Refer to the General Housekeeping section for particulars regarding practices to be followed for this specific setup</w:t>
+        <w:t xml:space="preserve"> The lab should be completely clean, including all equipment stored away, after testing. Refer to the </w:t>
+      </w:r>
+      <w:r>
+        <w:rPr>
+          <w:sz w:val="22"/>
+          <w:szCs w:val="22"/>
+        </w:rPr>
+        <w:lastRenderedPageBreak/>
+        <w:t>General Housekeeping section for particulars regarding practices to be followed for this specific setup</w:t>
       </w:r>
       <w:r>
         <w:rPr>
@@ -9561,55 +10207,165 @@
           <w:sz w:val="22"/>
           <w:szCs w:val="22"/>
         </w:rPr>
-        <w:t>by the aforementioned warning</w:t>
-      </w:r>
-      <w:r>
-        <w:rPr>
-          <w:rFonts w:ascii="Arial" w:eastAsia="Arial" w:hAnsi="Arial"/>
-          <w:sz w:val="22"/>
-          <w:szCs w:val="22"/>
-        </w:rPr>
-        <w:t>. T</w:t>
-      </w:r>
-      <w:r>
-        <w:rPr>
-          <w:rFonts w:ascii="Arial" w:eastAsia="Arial" w:hAnsi="Arial"/>
-          <w:sz w:val="22"/>
-          <w:szCs w:val="22"/>
-        </w:rPr>
-        <w:t xml:space="preserve">he workspace will be isolated </w:t>
-      </w:r>
-      <w:r>
-        <w:rPr>
-          <w:rFonts w:ascii="Arial" w:eastAsia="Arial" w:hAnsi="Arial"/>
-          <w:sz w:val="22"/>
-          <w:szCs w:val="22"/>
-        </w:rPr>
-        <w:t xml:space="preserve">to prevent </w:t>
-      </w:r>
-      <w:r>
-        <w:rPr>
-          <w:rFonts w:ascii="Arial" w:eastAsia="Arial" w:hAnsi="Arial"/>
-          <w:sz w:val="22"/>
-          <w:szCs w:val="22"/>
-        </w:rPr>
-        <w:t>accidental interfe</w:t>
-      </w:r>
-      <w:r>
-        <w:rPr>
-          <w:rFonts w:ascii="Arial" w:eastAsia="Arial" w:hAnsi="Arial"/>
-          <w:sz w:val="22"/>
-          <w:szCs w:val="22"/>
-        </w:rPr>
-        <w:t>rence with t</w:t>
-      </w:r>
-      <w:r>
-        <w:rPr>
-          <w:rFonts w:ascii="Arial" w:eastAsia="Arial" w:hAnsi="Arial"/>
-          <w:sz w:val="22"/>
-          <w:szCs w:val="22"/>
-        </w:rPr>
-        <w:t>he experimental setup.</w:t>
+        <w:t xml:space="preserve">by the </w:t>
+      </w:r>
+      <w:r>
+        <w:rPr>
+          <w:rFonts w:ascii="Arial" w:eastAsia="Arial" w:hAnsi="Arial"/>
+          <w:sz w:val="22"/>
+          <w:szCs w:val="22"/>
+        </w:rPr>
+        <w:t>warning</w:t>
+      </w:r>
+      <w:r>
+        <w:rPr>
+          <w:rFonts w:ascii="Arial" w:eastAsia="Arial" w:hAnsi="Arial"/>
+          <w:sz w:val="22"/>
+          <w:szCs w:val="22"/>
+        </w:rPr>
+        <w:t xml:space="preserve"> signs.</w:t>
+      </w:r>
+    </w:p>
+    <w:p>
+      <w:pPr>
+        <w:spacing w:line="0" w:lineRule="atLeast"/>
+        <w:rPr>
+          <w:rFonts w:ascii="Arial" w:eastAsia="Arial" w:hAnsi="Arial"/>
+          <w:sz w:val="22"/>
+          <w:szCs w:val="22"/>
+        </w:rPr>
+      </w:pPr>
+    </w:p>
+    <w:p>
+      <w:pPr>
+        <w:spacing w:line="0" w:lineRule="atLeast"/>
+        <w:rPr>
+          <w:rFonts w:ascii="Arial" w:eastAsia="Arial" w:hAnsi="Arial"/>
+          <w:sz w:val="22"/>
+          <w:szCs w:val="22"/>
+        </w:rPr>
+      </w:pPr>
+      <w:r>
+        <w:rPr>
+          <w:rFonts w:ascii="Arial" w:eastAsia="Arial" w:hAnsi="Arial"/>
+          <w:sz w:val="22"/>
+          <w:szCs w:val="22"/>
+        </w:rPr>
+        <w:t>To ensure the integrity of the experiment</w:t>
+      </w:r>
+      <w:r>
+        <w:rPr>
+          <w:rFonts w:ascii="Arial" w:eastAsia="Arial" w:hAnsi="Arial"/>
+          <w:sz w:val="22"/>
+          <w:szCs w:val="22"/>
+        </w:rPr>
+        <w:t xml:space="preserve"> while unattended, </w:t>
+      </w:r>
+      <w:r>
+        <w:rPr>
+          <w:rFonts w:ascii="Arial" w:eastAsia="Arial" w:hAnsi="Arial"/>
+          <w:sz w:val="22"/>
+          <w:szCs w:val="22"/>
+        </w:rPr>
+        <w:t xml:space="preserve">a </w:t>
+      </w:r>
+      <w:r>
+        <w:rPr>
+          <w:rFonts w:ascii="Arial" w:eastAsia="Arial" w:hAnsi="Arial"/>
+          <w:sz w:val="22"/>
+          <w:szCs w:val="22"/>
+        </w:rPr>
+        <w:t>“Do No Touch / Experiment in Progress”-</w:t>
+      </w:r>
+      <w:r>
+        <w:rPr>
+          <w:rFonts w:ascii="Arial" w:eastAsia="Arial" w:hAnsi="Arial"/>
+          <w:sz w:val="22"/>
+          <w:szCs w:val="22"/>
+        </w:rPr>
+        <w:t xml:space="preserve">sign </w:t>
+      </w:r>
+      <w:r>
+        <w:rPr>
+          <w:rFonts w:ascii="Arial" w:eastAsia="Arial" w:hAnsi="Arial"/>
+          <w:sz w:val="22"/>
+          <w:szCs w:val="22"/>
+        </w:rPr>
+        <w:t xml:space="preserve">will be hung in the vicinity of </w:t>
+      </w:r>
+      <w:r>
+        <w:rPr>
+          <w:rFonts w:ascii="Arial" w:eastAsia="Arial" w:hAnsi="Arial"/>
+          <w:sz w:val="22"/>
+          <w:szCs w:val="22"/>
+        </w:rPr>
+        <w:t xml:space="preserve">the </w:t>
+      </w:r>
+      <w:r>
+        <w:rPr>
+          <w:rFonts w:ascii="Arial" w:eastAsia="Arial" w:hAnsi="Arial"/>
+          <w:sz w:val="22"/>
+          <w:szCs w:val="22"/>
+        </w:rPr>
+        <w:t>physical setup</w:t>
+      </w:r>
+      <w:r>
+        <w:rPr>
+          <w:rFonts w:ascii="Arial" w:eastAsia="Arial" w:hAnsi="Arial"/>
+          <w:sz w:val="22"/>
+          <w:szCs w:val="22"/>
+        </w:rPr>
+        <w:t xml:space="preserve">. </w:t>
+      </w:r>
+      <w:r>
+        <w:rPr>
+          <w:rFonts w:ascii="Arial" w:eastAsia="Arial" w:hAnsi="Arial"/>
+          <w:sz w:val="22"/>
+          <w:szCs w:val="22"/>
+        </w:rPr>
+        <w:t xml:space="preserve">Furthermore, the Manson DC power supply and all control </w:t>
+      </w:r>
+      <w:proofErr w:type="gramStart"/>
+      <w:r>
+        <w:rPr>
+          <w:rFonts w:ascii="Arial" w:eastAsia="Arial" w:hAnsi="Arial"/>
+          <w:sz w:val="22"/>
+          <w:szCs w:val="22"/>
+        </w:rPr>
+        <w:t>circuitry</w:t>
+      </w:r>
+      <w:proofErr w:type="gramEnd"/>
+      <w:r>
+        <w:rPr>
+          <w:rFonts w:ascii="Arial" w:eastAsia="Arial" w:hAnsi="Arial"/>
+          <w:sz w:val="22"/>
+          <w:szCs w:val="22"/>
+        </w:rPr>
+        <w:t xml:space="preserve"> will be </w:t>
+      </w:r>
+      <w:r>
+        <w:rPr>
+          <w:rFonts w:ascii="Arial" w:eastAsia="Arial" w:hAnsi="Arial"/>
+          <w:sz w:val="22"/>
+          <w:szCs w:val="22"/>
+        </w:rPr>
+        <w:t xml:space="preserve">disconnected from the mains and locked in a secure cabinet </w:t>
+      </w:r>
+      <w:r>
+        <w:rPr>
+          <w:rFonts w:ascii="Arial" w:eastAsia="Arial" w:hAnsi="Arial"/>
+          <w:sz w:val="22"/>
+          <w:szCs w:val="22"/>
+        </w:rPr>
+        <w:t xml:space="preserve">or drawer when the researcher is absent to prevent unauthorized </w:t>
+      </w:r>
+      <w:r>
+        <w:rPr>
+          <w:rFonts w:ascii="Arial" w:eastAsia="Arial" w:hAnsi="Arial"/>
+          <w:sz w:val="22"/>
+          <w:szCs w:val="22"/>
+        </w:rPr>
+        <w:t>actuation of the electromagnet.</w:t>
       </w:r>
     </w:p>
     <w:p>
@@ -10056,7 +10812,7 @@
                 <w:sz w:val="22"/>
                 <w:szCs w:val="22"/>
               </w:rPr>
-              <w:t>Moving around the lab</w:t>
+              <w:t>Entering the lab</w:t>
             </w:r>
           </w:p>
         </w:tc>
@@ -10079,23 +10835,7 @@
                 <w:sz w:val="22"/>
                 <w:szCs w:val="22"/>
               </w:rPr>
-              <w:t xml:space="preserve">Tripping over cables or knocking equipment </w:t>
-            </w:r>
-            <w:r>
-              <w:rPr>
-                <w:rFonts w:ascii="Arial" w:eastAsia="Arial" w:hAnsi="Arial"/>
-                <w:sz w:val="22"/>
-                <w:szCs w:val="22"/>
-              </w:rPr>
-              <w:t>over</w:t>
-            </w:r>
-            <w:r>
-              <w:rPr>
-                <w:rFonts w:ascii="Arial" w:eastAsia="Arial" w:hAnsi="Arial"/>
-                <w:sz w:val="22"/>
-                <w:szCs w:val="22"/>
-              </w:rPr>
-              <w:t xml:space="preserve"> </w:t>
+              <w:t>Injuries to hands from gates / doors</w:t>
             </w:r>
           </w:p>
         </w:tc>
@@ -10141,15 +10881,7 @@
                 <w:sz w:val="22"/>
                 <w:szCs w:val="22"/>
               </w:rPr>
-              <w:t>Do not use a cell phone when moving through th</w:t>
-            </w:r>
-            <w:r>
-              <w:rPr>
-                <w:rFonts w:ascii="Arial" w:eastAsia="Arial" w:hAnsi="Arial"/>
-                <w:sz w:val="22"/>
-                <w:szCs w:val="22"/>
-              </w:rPr>
-              <w:t>e lab and be aware of your surroundings.</w:t>
+              <w:t>Use caution when using the gates or heavy doors.</w:t>
             </w:r>
           </w:p>
         </w:tc>
@@ -10200,7 +10932,7 @@
                 <w:sz w:val="22"/>
                 <w:szCs w:val="22"/>
               </w:rPr>
-              <w:t>Manual surface prep</w:t>
+              <w:t>Moving around the lab</w:t>
             </w:r>
           </w:p>
         </w:tc>
@@ -10223,15 +10955,7 @@
                 <w:sz w:val="22"/>
                 <w:szCs w:val="22"/>
               </w:rPr>
-              <w:t xml:space="preserve">Minor abrasions / </w:t>
-            </w:r>
-            <w:r>
-              <w:rPr>
-                <w:rFonts w:ascii="Arial" w:eastAsia="Arial" w:hAnsi="Arial"/>
-                <w:sz w:val="22"/>
-                <w:szCs w:val="22"/>
-              </w:rPr>
-              <w:t>Dust</w:t>
+              <w:t xml:space="preserve">Tripping over cables or knocking equipment over </w:t>
             </w:r>
           </w:p>
         </w:tc>
@@ -10277,7 +11001,7 @@
                 <w:sz w:val="22"/>
                 <w:szCs w:val="22"/>
               </w:rPr>
-              <w:t>Sand carefully away from the body and wipe away dust. Wear safety glasses.</w:t>
+              <w:t>Do not use a cell phone when moving through the lab and be aware of your surroundings.</w:t>
             </w:r>
           </w:p>
         </w:tc>
@@ -10300,15 +11024,7 @@
                 <w:sz w:val="22"/>
                 <w:szCs w:val="22"/>
               </w:rPr>
-              <w:t>Accep</w:t>
-            </w:r>
-            <w:r>
-              <w:rPr>
-                <w:rFonts w:ascii="Arial" w:eastAsia="Arial" w:hAnsi="Arial"/>
-                <w:sz w:val="22"/>
-                <w:szCs w:val="22"/>
-              </w:rPr>
-              <w:t>table risk</w:t>
+              <w:t>Acceptable risk</w:t>
             </w:r>
           </w:p>
         </w:tc>
@@ -10336,7 +11052,7 @@
                 <w:sz w:val="22"/>
                 <w:szCs w:val="22"/>
               </w:rPr>
-              <w:t>Using RMS 1 spray and adhesives</w:t>
+              <w:t>Manual surface prep</w:t>
             </w:r>
           </w:p>
         </w:tc>
@@ -10359,7 +11075,15 @@
                 <w:sz w:val="22"/>
                 <w:szCs w:val="22"/>
               </w:rPr>
-              <w:t>Skin irritation, inhalation</w:t>
+              <w:t xml:space="preserve">Minor abrasions / </w:t>
+            </w:r>
+            <w:r>
+              <w:rPr>
+                <w:rFonts w:ascii="Arial" w:eastAsia="Arial" w:hAnsi="Arial"/>
+                <w:sz w:val="22"/>
+                <w:szCs w:val="22"/>
+              </w:rPr>
+              <w:t>Dust</w:t>
             </w:r>
           </w:p>
         </w:tc>
@@ -10405,15 +11129,7 @@
                 <w:sz w:val="22"/>
                 <w:szCs w:val="22"/>
               </w:rPr>
-              <w:t xml:space="preserve">Ensure </w:t>
-            </w:r>
-            <w:r>
-              <w:rPr>
-                <w:rFonts w:ascii="Arial" w:eastAsia="Arial" w:hAnsi="Arial"/>
-                <w:sz w:val="22"/>
-                <w:szCs w:val="22"/>
-              </w:rPr>
-              <w:t>adequate ventilation. Avoid breathing vapours and wear gloves.</w:t>
+              <w:t>Sand carefully away from the body and wipe away dust. Wear safety glasses.</w:t>
             </w:r>
           </w:p>
         </w:tc>
@@ -10436,7 +11152,15 @@
                 <w:sz w:val="22"/>
                 <w:szCs w:val="22"/>
               </w:rPr>
-              <w:t>Possible risk</w:t>
+              <w:t>Accep</w:t>
+            </w:r>
+            <w:r>
+              <w:rPr>
+                <w:rFonts w:ascii="Arial" w:eastAsia="Arial" w:hAnsi="Arial"/>
+                <w:sz w:val="22"/>
+                <w:szCs w:val="22"/>
+              </w:rPr>
+              <w:t>table risk</w:t>
             </w:r>
           </w:p>
         </w:tc>
@@ -10464,7 +11188,8 @@
                 <w:sz w:val="22"/>
                 <w:szCs w:val="22"/>
               </w:rPr>
-              <w:t>Soldering strain gauges</w:t>
+              <w:lastRenderedPageBreak/>
+              <w:t>Using RMS 1 spray and adhesives</w:t>
             </w:r>
           </w:p>
         </w:tc>
@@ -10487,7 +11212,7 @@
                 <w:sz w:val="22"/>
                 <w:szCs w:val="22"/>
               </w:rPr>
-              <w:t>Burns to skin, fire hazard</w:t>
+              <w:t>Skin irritation, inhalation</w:t>
             </w:r>
           </w:p>
         </w:tc>
@@ -10510,7 +11235,7 @@
                 <w:sz w:val="22"/>
                 <w:szCs w:val="22"/>
               </w:rPr>
-              <w:t>P/E</w:t>
+              <w:t>P</w:t>
             </w:r>
           </w:p>
         </w:tc>
@@ -10533,15 +11258,15 @@
                 <w:sz w:val="22"/>
                 <w:szCs w:val="22"/>
               </w:rPr>
-              <w:t xml:space="preserve">Use a soldering iron stand. Keep flammable liquids away. Never </w:t>
-            </w:r>
-            <w:r>
-              <w:rPr>
-                <w:rFonts w:ascii="Arial" w:eastAsia="Arial" w:hAnsi="Arial"/>
-                <w:sz w:val="22"/>
-                <w:szCs w:val="22"/>
-              </w:rPr>
-              <w:t>leave iron unattended.</w:t>
+              <w:t xml:space="preserve">Ensure </w:t>
+            </w:r>
+            <w:r>
+              <w:rPr>
+                <w:rFonts w:ascii="Arial" w:eastAsia="Arial" w:hAnsi="Arial"/>
+                <w:sz w:val="22"/>
+                <w:szCs w:val="22"/>
+              </w:rPr>
+              <w:t>adequate ventilation. Avoid breathing vapours and wear gloves.</w:t>
             </w:r>
           </w:p>
         </w:tc>
@@ -10564,7 +11289,7 @@
                 <w:sz w:val="22"/>
                 <w:szCs w:val="22"/>
               </w:rPr>
-              <w:t>High risk</w:t>
+              <w:t>Possible risk</w:t>
             </w:r>
           </w:p>
         </w:tc>
@@ -10592,7 +11317,7 @@
                 <w:sz w:val="22"/>
                 <w:szCs w:val="22"/>
               </w:rPr>
-              <w:t>Testing the switching circuit</w:t>
+              <w:t>Soldering strain gauges</w:t>
             </w:r>
           </w:p>
         </w:tc>
@@ -10615,7 +11340,7 @@
                 <w:sz w:val="22"/>
                 <w:szCs w:val="22"/>
               </w:rPr>
-              <w:t>Electric shock</w:t>
+              <w:t>Burns to skin, fire hazard</w:t>
             </w:r>
           </w:p>
         </w:tc>
@@ -10638,7 +11363,7 @@
                 <w:sz w:val="22"/>
                 <w:szCs w:val="22"/>
               </w:rPr>
-              <w:t>P</w:t>
+              <w:t>P/E</w:t>
             </w:r>
           </w:p>
         </w:tc>
@@ -10661,113 +11386,15 @@
                 <w:sz w:val="22"/>
                 <w:szCs w:val="22"/>
               </w:rPr>
-              <w:t xml:space="preserve">Inspect all cable insulation before turning </w:t>
-            </w:r>
-            <w:r>
-              <w:rPr>
-                <w:rFonts w:ascii="Arial" w:eastAsia="Arial" w:hAnsi="Arial"/>
-                <w:sz w:val="22"/>
-                <w:szCs w:val="22"/>
-              </w:rPr>
-              <w:t>on the power</w:t>
-            </w:r>
-            <w:r>
-              <w:rPr>
-                <w:rFonts w:ascii="Arial" w:eastAsia="Arial" w:hAnsi="Arial"/>
-                <w:sz w:val="22"/>
-                <w:szCs w:val="22"/>
-              </w:rPr>
-              <w:t xml:space="preserve"> and ensure </w:t>
-            </w:r>
-            <w:r>
-              <w:rPr>
-                <w:rFonts w:ascii="Arial" w:eastAsia="Arial" w:hAnsi="Arial"/>
-                <w:sz w:val="22"/>
-                <w:szCs w:val="22"/>
-              </w:rPr>
-              <w:t xml:space="preserve">wire gauges can handle </w:t>
-            </w:r>
-            <m:oMath>
-              <m:r>
-                <w:rPr>
-                  <w:rFonts w:ascii="Cambria Math" w:eastAsia="Arial" w:hAnsi="Cambria Math"/>
-                  <w:sz w:val="22"/>
-                  <w:szCs w:val="22"/>
-                </w:rPr>
-                <m:t>6 A</m:t>
-              </m:r>
-            </m:oMath>
-            <w:r>
-              <w:rPr>
-                <w:rFonts w:ascii="Arial" w:eastAsia="Arial" w:hAnsi="Arial"/>
-                <w:sz w:val="22"/>
-                <w:szCs w:val="22"/>
-              </w:rPr>
-              <w:t xml:space="preserve"> safely </w:t>
-            </w:r>
-            <w:r>
-              <w:rPr>
-                <w:rFonts w:ascii="Arial" w:eastAsia="Arial" w:hAnsi="Arial"/>
-                <w:sz w:val="22"/>
-                <w:szCs w:val="22"/>
-              </w:rPr>
-              <w:t xml:space="preserve">before turning on </w:t>
-            </w:r>
-            <w:r>
-              <w:rPr>
-                <w:rFonts w:ascii="Arial" w:eastAsia="Arial" w:hAnsi="Arial"/>
-                <w:sz w:val="22"/>
-                <w:szCs w:val="22"/>
-              </w:rPr>
-              <w:t>the power</w:t>
-            </w:r>
-            <w:r>
-              <w:rPr>
-                <w:rFonts w:ascii="Arial" w:eastAsia="Arial" w:hAnsi="Arial"/>
-                <w:sz w:val="22"/>
-                <w:szCs w:val="22"/>
-              </w:rPr>
-              <w:t>.</w:t>
-            </w:r>
-            <w:r>
-              <w:rPr>
-                <w:rFonts w:ascii="Arial" w:eastAsia="Arial" w:hAnsi="Arial"/>
-                <w:sz w:val="22"/>
-                <w:szCs w:val="22"/>
-              </w:rPr>
-              <w:t xml:space="preserve"> Ensure the dedicated </w:t>
-            </w:r>
-            <w:r>
-              <w:rPr>
-                <w:rFonts w:ascii="Arial" w:eastAsia="Arial" w:hAnsi="Arial"/>
-                <w:sz w:val="22"/>
-                <w:szCs w:val="22"/>
-              </w:rPr>
-              <w:t xml:space="preserve">normally closed (NC) emergency stop button is </w:t>
-            </w:r>
-            <w:r>
-              <w:rPr>
-                <w:rFonts w:ascii="Arial" w:eastAsia="Arial" w:hAnsi="Arial"/>
-                <w:sz w:val="22"/>
-                <w:szCs w:val="22"/>
-              </w:rPr>
-              <w:t>within immediate reach and tested before</w:t>
-            </w:r>
-            <w:r>
-              <w:rPr>
-                <w:rFonts w:ascii="Arial" w:eastAsia="Arial" w:hAnsi="Arial"/>
-                <w:sz w:val="22"/>
-                <w:szCs w:val="22"/>
-              </w:rPr>
-              <w:t xml:space="preserve"> full operation</w:t>
-            </w:r>
-            <w:r>
-              <w:rPr>
-                <w:rFonts w:ascii="Arial" w:eastAsia="Arial" w:hAnsi="Arial"/>
-                <w:sz w:val="22"/>
-                <w:szCs w:val="22"/>
-              </w:rPr>
-              <w:t>.</w:t>
+              <w:t xml:space="preserve">Use a soldering iron stand. Keep flammable liquids away. Never </w:t>
+            </w:r>
+            <w:r>
+              <w:rPr>
+                <w:rFonts w:ascii="Arial" w:eastAsia="Arial" w:hAnsi="Arial"/>
+                <w:sz w:val="22"/>
+                <w:szCs w:val="22"/>
+              </w:rPr>
+              <w:t>leave iron unattended.</w:t>
             </w:r>
           </w:p>
         </w:tc>
@@ -10790,7 +11417,7 @@
                 <w:sz w:val="22"/>
                 <w:szCs w:val="22"/>
               </w:rPr>
-              <w:t>Substantial risk</w:t>
+              <w:t>High risk</w:t>
             </w:r>
           </w:p>
         </w:tc>
@@ -10818,7 +11445,7 @@
                 <w:sz w:val="22"/>
                 <w:szCs w:val="22"/>
               </w:rPr>
-              <w:t>Actuating the electromagnet</w:t>
+              <w:t>Testing the switching circuit</w:t>
             </w:r>
           </w:p>
         </w:tc>
@@ -10841,7 +11468,7 @@
                 <w:sz w:val="22"/>
                 <w:szCs w:val="22"/>
               </w:rPr>
-              <w:t>Crushing fingers / Pinch point</w:t>
+              <w:t>Electric shock</w:t>
             </w:r>
           </w:p>
         </w:tc>
@@ -10887,7 +11514,65 @@
                 <w:sz w:val="22"/>
                 <w:szCs w:val="22"/>
               </w:rPr>
-              <w:t>Keep hands clear of moving parts</w:t>
+              <w:t xml:space="preserve">Inspect all cable insulation before turning </w:t>
+            </w:r>
+            <w:r>
+              <w:rPr>
+                <w:rFonts w:ascii="Arial" w:eastAsia="Arial" w:hAnsi="Arial"/>
+                <w:sz w:val="22"/>
+                <w:szCs w:val="22"/>
+              </w:rPr>
+              <w:t>on the power</w:t>
+            </w:r>
+            <w:r>
+              <w:rPr>
+                <w:rFonts w:ascii="Arial" w:eastAsia="Arial" w:hAnsi="Arial"/>
+                <w:sz w:val="22"/>
+                <w:szCs w:val="22"/>
+              </w:rPr>
+              <w:t xml:space="preserve"> and ensure </w:t>
+            </w:r>
+            <w:r>
+              <w:rPr>
+                <w:rFonts w:ascii="Arial" w:eastAsia="Arial" w:hAnsi="Arial"/>
+                <w:sz w:val="22"/>
+                <w:szCs w:val="22"/>
+              </w:rPr>
+              <w:t xml:space="preserve">wire gauges can handle </w:t>
+            </w:r>
+            <m:oMath>
+              <m:r>
+                <w:rPr>
+                  <w:rFonts w:ascii="Cambria Math" w:eastAsia="Arial" w:hAnsi="Cambria Math"/>
+                  <w:sz w:val="22"/>
+                  <w:szCs w:val="22"/>
+                </w:rPr>
+                <m:t>6 A</m:t>
+              </m:r>
+            </m:oMath>
+            <w:r>
+              <w:rPr>
+                <w:rFonts w:ascii="Arial" w:eastAsia="Arial" w:hAnsi="Arial"/>
+                <w:sz w:val="22"/>
+                <w:szCs w:val="22"/>
+              </w:rPr>
+              <w:t xml:space="preserve"> safely </w:t>
+            </w:r>
+            <w:r>
+              <w:rPr>
+                <w:rFonts w:ascii="Arial" w:eastAsia="Arial" w:hAnsi="Arial"/>
+                <w:sz w:val="22"/>
+                <w:szCs w:val="22"/>
+              </w:rPr>
+              <w:t xml:space="preserve">before turning on </w:t>
+            </w:r>
+            <w:r>
+              <w:rPr>
+                <w:rFonts w:ascii="Arial" w:eastAsia="Arial" w:hAnsi="Arial"/>
+                <w:sz w:val="22"/>
+                <w:szCs w:val="22"/>
+              </w:rPr>
+              <w:t>the power</w:t>
             </w:r>
             <w:r>
               <w:rPr>
@@ -10903,31 +11588,39 @@
                 <w:sz w:val="22"/>
                 <w:szCs w:val="22"/>
               </w:rPr>
-              <w:t xml:space="preserve"> Keep one hand</w:t>
-            </w:r>
-            <w:r>
-              <w:rPr>
-                <w:rFonts w:ascii="Arial" w:eastAsia="Arial" w:hAnsi="Arial"/>
-                <w:sz w:val="22"/>
-                <w:szCs w:val="22"/>
-              </w:rPr>
-              <w:t xml:space="preserve"> hovering near the emergency stop button durin</w:t>
-            </w:r>
-            <w:r>
-              <w:rPr>
-                <w:rFonts w:ascii="Arial" w:eastAsia="Arial" w:hAnsi="Arial"/>
-                <w:sz w:val="22"/>
-                <w:szCs w:val="22"/>
-              </w:rPr>
-              <w:t>g</w:t>
-            </w:r>
-            <w:r>
-              <w:rPr>
-                <w:rFonts w:ascii="Arial" w:eastAsia="Arial" w:hAnsi="Arial"/>
-                <w:sz w:val="22"/>
-                <w:szCs w:val="22"/>
-              </w:rPr>
-              <w:t xml:space="preserve"> actuation.</w:t>
+              <w:t xml:space="preserve"> Ensure the dedicated </w:t>
+            </w:r>
+            <w:r>
+              <w:rPr>
+                <w:rFonts w:ascii="Arial" w:eastAsia="Arial" w:hAnsi="Arial"/>
+                <w:sz w:val="22"/>
+                <w:szCs w:val="22"/>
+              </w:rPr>
+              <w:t xml:space="preserve">normally closed (NC) emergency stop button is </w:t>
+            </w:r>
+            <w:r>
+              <w:rPr>
+                <w:rFonts w:ascii="Arial" w:eastAsia="Arial" w:hAnsi="Arial"/>
+                <w:sz w:val="22"/>
+                <w:szCs w:val="22"/>
+              </w:rPr>
+              <w:t>within immediate reach and tested before</w:t>
+            </w:r>
+            <w:r>
+              <w:rPr>
+                <w:rFonts w:ascii="Arial" w:eastAsia="Arial" w:hAnsi="Arial"/>
+                <w:sz w:val="22"/>
+                <w:szCs w:val="22"/>
+              </w:rPr>
+              <w:t xml:space="preserve"> full operation</w:t>
+            </w:r>
+            <w:r>
+              <w:rPr>
+                <w:rFonts w:ascii="Arial" w:eastAsia="Arial" w:hAnsi="Arial"/>
+                <w:sz w:val="22"/>
+                <w:szCs w:val="22"/>
+              </w:rPr>
+              <w:t>.</w:t>
             </w:r>
           </w:p>
         </w:tc>
@@ -10950,7 +11643,7 @@
                 <w:sz w:val="22"/>
                 <w:szCs w:val="22"/>
               </w:rPr>
-              <w:t>Possible risk</w:t>
+              <w:t>Substantial risk</w:t>
             </w:r>
           </w:p>
         </w:tc>
@@ -10978,7 +11671,7 @@
                 <w:sz w:val="22"/>
                 <w:szCs w:val="22"/>
               </w:rPr>
-              <w:t>Operating the electromagnet</w:t>
+              <w:t>Actuating the electromagnet</w:t>
             </w:r>
           </w:p>
         </w:tc>
@@ -11001,39 +11694,7 @@
                 <w:sz w:val="22"/>
                 <w:szCs w:val="22"/>
               </w:rPr>
-              <w:t xml:space="preserve">Strong </w:t>
-            </w:r>
-            <w:r>
-              <w:rPr>
-                <w:rFonts w:ascii="Arial" w:eastAsia="Arial" w:hAnsi="Arial"/>
-                <w:sz w:val="22"/>
-                <w:szCs w:val="22"/>
-              </w:rPr>
-              <w:t>m</w:t>
-            </w:r>
-            <w:r>
-              <w:rPr>
-                <w:rFonts w:ascii="Arial" w:eastAsia="Arial" w:hAnsi="Arial"/>
-                <w:sz w:val="22"/>
-                <w:szCs w:val="22"/>
-              </w:rPr>
-              <w:t xml:space="preserve">agnetic </w:t>
-            </w:r>
-            <w:r>
-              <w:rPr>
-                <w:rFonts w:ascii="Arial" w:eastAsia="Arial" w:hAnsi="Arial"/>
-                <w:sz w:val="22"/>
-                <w:szCs w:val="22"/>
-              </w:rPr>
-              <w:t xml:space="preserve">field hazard / </w:t>
-            </w:r>
-            <w:r>
-              <w:rPr>
-                <w:rFonts w:ascii="Arial" w:eastAsia="Arial" w:hAnsi="Arial"/>
-                <w:sz w:val="22"/>
-                <w:szCs w:val="22"/>
-              </w:rPr>
-              <w:t>Magnetic interference</w:t>
+              <w:t>Crushing fingers / Pinch point</w:t>
             </w:r>
           </w:p>
         </w:tc>
@@ -11056,7 +11717,7 @@
                 <w:sz w:val="22"/>
                 <w:szCs w:val="22"/>
               </w:rPr>
-              <w:t>P/E</w:t>
+              <w:t>P</w:t>
             </w:r>
           </w:p>
         </w:tc>
@@ -11079,39 +11740,47 @@
                 <w:sz w:val="22"/>
                 <w:szCs w:val="22"/>
               </w:rPr>
-              <w:t xml:space="preserve">Strictly enforce an exclusion zone for individuals with </w:t>
-            </w:r>
-            <w:r>
-              <w:rPr>
-                <w:rFonts w:ascii="Arial" w:eastAsia="Arial" w:hAnsi="Arial"/>
-                <w:sz w:val="22"/>
-                <w:szCs w:val="22"/>
-              </w:rPr>
-              <w:t>pacemakers or metallic implants. U</w:t>
-            </w:r>
-            <w:r>
-              <w:rPr>
-                <w:rFonts w:ascii="Arial" w:eastAsia="Arial" w:hAnsi="Arial"/>
-                <w:sz w:val="22"/>
-                <w:szCs w:val="22"/>
-              </w:rPr>
-              <w:t>se the emergence stop immediately if unauthorised personnel enter the testing</w:t>
-            </w:r>
-            <w:r>
-              <w:rPr>
-                <w:rFonts w:ascii="Arial" w:eastAsia="Arial" w:hAnsi="Arial"/>
-                <w:sz w:val="22"/>
-                <w:szCs w:val="22"/>
-              </w:rPr>
-              <w:t xml:space="preserve"> area.</w:t>
-            </w:r>
-            <w:r>
-              <w:rPr>
-                <w:rFonts w:ascii="Arial" w:eastAsia="Arial" w:hAnsi="Arial"/>
-                <w:sz w:val="22"/>
-                <w:szCs w:val="22"/>
-              </w:rPr>
-              <w:t xml:space="preserve">                 </w:t>
+              <w:t>Keep hands clear of moving parts</w:t>
+            </w:r>
+            <w:r>
+              <w:rPr>
+                <w:rFonts w:ascii="Arial" w:eastAsia="Arial" w:hAnsi="Arial"/>
+                <w:sz w:val="22"/>
+                <w:szCs w:val="22"/>
+              </w:rPr>
+              <w:t>.</w:t>
+            </w:r>
+            <w:r>
+              <w:rPr>
+                <w:rFonts w:ascii="Arial" w:eastAsia="Arial" w:hAnsi="Arial"/>
+                <w:sz w:val="22"/>
+                <w:szCs w:val="22"/>
+              </w:rPr>
+              <w:t xml:space="preserve"> Keep one hand</w:t>
+            </w:r>
+            <w:r>
+              <w:rPr>
+                <w:rFonts w:ascii="Arial" w:eastAsia="Arial" w:hAnsi="Arial"/>
+                <w:sz w:val="22"/>
+                <w:szCs w:val="22"/>
+              </w:rPr>
+              <w:t xml:space="preserve"> hovering near the emergency stop button durin</w:t>
+            </w:r>
+            <w:r>
+              <w:rPr>
+                <w:rFonts w:ascii="Arial" w:eastAsia="Arial" w:hAnsi="Arial"/>
+                <w:sz w:val="22"/>
+                <w:szCs w:val="22"/>
+              </w:rPr>
+              <w:t>g</w:t>
+            </w:r>
+            <w:r>
+              <w:rPr>
+                <w:rFonts w:ascii="Arial" w:eastAsia="Arial" w:hAnsi="Arial"/>
+                <w:sz w:val="22"/>
+                <w:szCs w:val="22"/>
+              </w:rPr>
+              <w:t xml:space="preserve"> actuation.</w:t>
             </w:r>
           </w:p>
         </w:tc>
@@ -11134,15 +11803,7 @@
                 <w:sz w:val="22"/>
                 <w:szCs w:val="22"/>
               </w:rPr>
-              <w:t xml:space="preserve">Substantial </w:t>
-            </w:r>
-            <w:r>
-              <w:rPr>
-                <w:rFonts w:ascii="Arial" w:eastAsia="Arial" w:hAnsi="Arial"/>
-                <w:sz w:val="22"/>
-                <w:szCs w:val="22"/>
-              </w:rPr>
-              <w:t>risk</w:t>
+              <w:t>Possible risk</w:t>
             </w:r>
           </w:p>
         </w:tc>
@@ -11170,7 +11831,7 @@
                 <w:sz w:val="22"/>
                 <w:szCs w:val="22"/>
               </w:rPr>
-              <w:t>Applying excessive load</w:t>
+              <w:t>Operating the electromagnet</w:t>
             </w:r>
           </w:p>
         </w:tc>
@@ -11193,7 +11854,39 @@
                 <w:sz w:val="22"/>
                 <w:szCs w:val="22"/>
               </w:rPr>
-              <w:t>Damaging strain gauges</w:t>
+              <w:t xml:space="preserve">Strong </w:t>
+            </w:r>
+            <w:r>
+              <w:rPr>
+                <w:rFonts w:ascii="Arial" w:eastAsia="Arial" w:hAnsi="Arial"/>
+                <w:sz w:val="22"/>
+                <w:szCs w:val="22"/>
+              </w:rPr>
+              <w:t>m</w:t>
+            </w:r>
+            <w:r>
+              <w:rPr>
+                <w:rFonts w:ascii="Arial" w:eastAsia="Arial" w:hAnsi="Arial"/>
+                <w:sz w:val="22"/>
+                <w:szCs w:val="22"/>
+              </w:rPr>
+              <w:t xml:space="preserve">agnetic </w:t>
+            </w:r>
+            <w:r>
+              <w:rPr>
+                <w:rFonts w:ascii="Arial" w:eastAsia="Arial" w:hAnsi="Arial"/>
+                <w:sz w:val="22"/>
+                <w:szCs w:val="22"/>
+              </w:rPr>
+              <w:t xml:space="preserve">field hazard / </w:t>
+            </w:r>
+            <w:r>
+              <w:rPr>
+                <w:rFonts w:ascii="Arial" w:eastAsia="Arial" w:hAnsi="Arial"/>
+                <w:sz w:val="22"/>
+                <w:szCs w:val="22"/>
+              </w:rPr>
+              <w:t>Magnetic interference</w:t>
             </w:r>
           </w:p>
         </w:tc>
@@ -11216,7 +11909,7 @@
                 <w:sz w:val="22"/>
                 <w:szCs w:val="22"/>
               </w:rPr>
-              <w:t>E</w:t>
+              <w:t>P/E</w:t>
             </w:r>
           </w:p>
         </w:tc>
@@ -11239,7 +11932,39 @@
                 <w:sz w:val="22"/>
                 <w:szCs w:val="22"/>
               </w:rPr>
-              <w:t>Verify all circuit limits before testing. Monitor data carefully.</w:t>
+              <w:t xml:space="preserve">Strictly enforce an exclusion zone for individuals with </w:t>
+            </w:r>
+            <w:r>
+              <w:rPr>
+                <w:rFonts w:ascii="Arial" w:eastAsia="Arial" w:hAnsi="Arial"/>
+                <w:sz w:val="22"/>
+                <w:szCs w:val="22"/>
+              </w:rPr>
+              <w:t>pacemakers or metallic implants. U</w:t>
+            </w:r>
+            <w:r>
+              <w:rPr>
+                <w:rFonts w:ascii="Arial" w:eastAsia="Arial" w:hAnsi="Arial"/>
+                <w:sz w:val="22"/>
+                <w:szCs w:val="22"/>
+              </w:rPr>
+              <w:t>se the emergence stop immediately if unauthorised personnel enter the testing</w:t>
+            </w:r>
+            <w:r>
+              <w:rPr>
+                <w:rFonts w:ascii="Arial" w:eastAsia="Arial" w:hAnsi="Arial"/>
+                <w:sz w:val="22"/>
+                <w:szCs w:val="22"/>
+              </w:rPr>
+              <w:t xml:space="preserve"> area.</w:t>
+            </w:r>
+            <w:r>
+              <w:rPr>
+                <w:rFonts w:ascii="Arial" w:eastAsia="Arial" w:hAnsi="Arial"/>
+                <w:sz w:val="22"/>
+                <w:szCs w:val="22"/>
+              </w:rPr>
+              <w:t xml:space="preserve">                 </w:t>
             </w:r>
           </w:p>
         </w:tc>
@@ -11262,6 +11987,134 @@
                 <w:sz w:val="22"/>
                 <w:szCs w:val="22"/>
               </w:rPr>
+              <w:t xml:space="preserve">Substantial </w:t>
+            </w:r>
+            <w:r>
+              <w:rPr>
+                <w:rFonts w:ascii="Arial" w:eastAsia="Arial" w:hAnsi="Arial"/>
+                <w:sz w:val="22"/>
+                <w:szCs w:val="22"/>
+              </w:rPr>
+              <w:t>risk</w:t>
+            </w:r>
+          </w:p>
+        </w:tc>
+      </w:tr>
+      <w:tr>
+        <w:trPr>
+          <w:jc w:val="center"/>
+        </w:trPr>
+        <w:tc>
+          <w:tcPr>
+            <w:tcW w:w="943" w:type="pct"/>
+          </w:tcPr>
+          <w:p>
+            <w:pPr>
+              <w:spacing w:line="0" w:lineRule="atLeast"/>
+              <w:rPr>
+                <w:rFonts w:ascii="Arial" w:eastAsia="Arial" w:hAnsi="Arial"/>
+                <w:sz w:val="22"/>
+                <w:szCs w:val="22"/>
+              </w:rPr>
+            </w:pPr>
+            <w:r>
+              <w:rPr>
+                <w:rFonts w:ascii="Arial" w:eastAsia="Arial" w:hAnsi="Arial"/>
+                <w:sz w:val="22"/>
+                <w:szCs w:val="22"/>
+              </w:rPr>
+              <w:t>Applying excessive load</w:t>
+            </w:r>
+          </w:p>
+        </w:tc>
+        <w:tc>
+          <w:tcPr>
+            <w:tcW w:w="785" w:type="pct"/>
+          </w:tcPr>
+          <w:p>
+            <w:pPr>
+              <w:spacing w:line="0" w:lineRule="atLeast"/>
+              <w:rPr>
+                <w:rFonts w:ascii="Arial" w:eastAsia="Arial" w:hAnsi="Arial"/>
+                <w:sz w:val="22"/>
+                <w:szCs w:val="22"/>
+              </w:rPr>
+            </w:pPr>
+            <w:r>
+              <w:rPr>
+                <w:rFonts w:ascii="Arial" w:eastAsia="Arial" w:hAnsi="Arial"/>
+                <w:sz w:val="22"/>
+                <w:szCs w:val="22"/>
+              </w:rPr>
+              <w:t>Damaging strain gauges</w:t>
+            </w:r>
+          </w:p>
+        </w:tc>
+        <w:tc>
+          <w:tcPr>
+            <w:tcW w:w="471" w:type="pct"/>
+          </w:tcPr>
+          <w:p>
+            <w:pPr>
+              <w:spacing w:line="0" w:lineRule="atLeast"/>
+              <w:rPr>
+                <w:rFonts w:ascii="Arial" w:eastAsia="Arial" w:hAnsi="Arial"/>
+                <w:sz w:val="22"/>
+                <w:szCs w:val="22"/>
+              </w:rPr>
+            </w:pPr>
+            <w:r>
+              <w:rPr>
+                <w:rFonts w:ascii="Arial" w:eastAsia="Arial" w:hAnsi="Arial"/>
+                <w:sz w:val="22"/>
+                <w:szCs w:val="22"/>
+              </w:rPr>
+              <w:t>E</w:t>
+            </w:r>
+          </w:p>
+        </w:tc>
+        <w:tc>
+          <w:tcPr>
+            <w:tcW w:w="1417" w:type="pct"/>
+          </w:tcPr>
+          <w:p>
+            <w:pPr>
+              <w:spacing w:line="0" w:lineRule="atLeast"/>
+              <w:rPr>
+                <w:rFonts w:ascii="Arial" w:eastAsia="Arial" w:hAnsi="Arial"/>
+                <w:sz w:val="22"/>
+                <w:szCs w:val="22"/>
+              </w:rPr>
+            </w:pPr>
+            <w:r>
+              <w:rPr>
+                <w:rFonts w:ascii="Arial" w:eastAsia="Arial" w:hAnsi="Arial"/>
+                <w:sz w:val="22"/>
+                <w:szCs w:val="22"/>
+              </w:rPr>
+              <w:t>Verify all circuit limits before testing. Monitor data carefully.</w:t>
+            </w:r>
+          </w:p>
+        </w:tc>
+        <w:tc>
+          <w:tcPr>
+            <w:tcW w:w="1384" w:type="pct"/>
+          </w:tcPr>
+          <w:p>
+            <w:pPr>
+              <w:spacing w:line="0" w:lineRule="atLeast"/>
+              <w:rPr>
+                <w:rFonts w:ascii="Arial" w:eastAsia="Arial" w:hAnsi="Arial"/>
+                <w:sz w:val="22"/>
+                <w:szCs w:val="22"/>
+              </w:rPr>
+            </w:pPr>
+            <w:r>
+              <w:rPr>
+                <w:rFonts w:ascii="Arial" w:eastAsia="Arial" w:hAnsi="Arial"/>
+                <w:sz w:val="22"/>
+                <w:szCs w:val="22"/>
+              </w:rPr>
               <w:t>Possible risk</w:t>
             </w:r>
           </w:p>
@@ -11357,14 +12210,32 @@
           <w:sz w:val="22"/>
           <w:szCs w:val="22"/>
         </w:rPr>
-        <w:t>Failure to comply with any of the aforementioned safety regulations</w:t>
-      </w:r>
+        <w:t xml:space="preserve">Failure to comply with any of the </w:t>
+      </w:r>
+      <w:proofErr w:type="gramStart"/>
       <w:r>
         <w:rPr>
           <w:rFonts w:ascii="Arial" w:eastAsia="Arial" w:hAnsi="Arial" w:cs="Arial"/>
           <w:sz w:val="22"/>
           <w:szCs w:val="22"/>
         </w:rPr>
+        <w:t>aforementioned safety</w:t>
+      </w:r>
+      <w:proofErr w:type="gramEnd"/>
+      <w:r>
+        <w:rPr>
+          <w:rFonts w:ascii="Arial" w:eastAsia="Arial" w:hAnsi="Arial" w:cs="Arial"/>
+          <w:sz w:val="22"/>
+          <w:szCs w:val="22"/>
+        </w:rPr>
+        <w:t xml:space="preserve"> regulations</w:t>
+      </w:r>
+      <w:r>
+        <w:rPr>
+          <w:rFonts w:ascii="Arial" w:eastAsia="Arial" w:hAnsi="Arial" w:cs="Arial"/>
+          <w:sz w:val="22"/>
+          <w:szCs w:val="22"/>
+        </w:rPr>
         <w:t xml:space="preserve"> or </w:t>
       </w:r>
       <w:r>
@@ -11375,6 +12246,16 @@
         </w:rPr>
         <w:t xml:space="preserve">procedures will result in disciplinary action. Students will be issued an initial warning: after three warnings, the lab access is revoked for a month. </w:t>
       </w:r>
+    </w:p>
+    <w:p>
+      <w:pPr>
+        <w:spacing w:line="0" w:lineRule="atLeast"/>
+      </w:pPr>
+    </w:p>
+    <w:p>
+      <w:pPr>
+        <w:spacing w:line="0" w:lineRule="atLeast"/>
+      </w:pPr>
     </w:p>
     <w:p>
       <w:pPr>
@@ -11430,6 +12311,7 @@
           <w:sz w:val="28"/>
           <w:szCs w:val="16"/>
         </w:rPr>
+        <w:lastRenderedPageBreak/>
         <w:t xml:space="preserve">Appendix A: </w:t>
       </w:r>
       <w:r>
@@ -11452,16 +12334,6 @@
         </w:rPr>
         <w:t>Mechatronics Lab Evacuation Labs</w:t>
       </w:r>
-    </w:p>
-    <w:p>
-      <w:pPr>
-        <w:spacing w:line="0" w:lineRule="atLeast"/>
-        <w:rPr>
-          <w:rFonts w:ascii="Arial" w:eastAsia="Arial" w:hAnsi="Arial"/>
-          <w:sz w:val="28"/>
-          <w:szCs w:val="16"/>
-        </w:rPr>
-      </w:pPr>
     </w:p>
     <w:p>
       <w:pPr>
@@ -12088,7 +12960,7 @@
                     <pic:cNvPicPr/>
                   </pic:nvPicPr>
                   <pic:blipFill>
-                    <a:blip r:embed="rId16"/>
+                    <a:blip r:embed="rId17"/>
                     <a:stretch>
                       <a:fillRect/>
                     </a:stretch>
@@ -12113,9 +12985,9 @@
       <w:bookmarkEnd w:id="2"/>
     </w:p>
     <w:sectPr>
-      <w:headerReference w:type="default" r:id="rId17"/>
-      <w:footerReference w:type="default" r:id="rId18"/>
-      <w:headerReference w:type="first" r:id="rId19"/>
+      <w:headerReference w:type="default" r:id="rId18"/>
+      <w:footerReference w:type="default" r:id="rId19"/>
+      <w:headerReference w:type="first" r:id="rId20"/>
       <w:pgSz w:w="11906" w:h="16838"/>
       <w:pgMar w:top="1440" w:right="1440" w:bottom="1440" w:left="1440" w:header="708" w:footer="708" w:gutter="0"/>
       <w:cols w:space="708"/>
@@ -12709,6 +13581,92 @@
     </w:lvl>
   </w:abstractNum>
   <w:abstractNum w:abstractNumId="4" w15:restartNumberingAfterBreak="0">
+    <w:nsid w:val="30D21875"/>
+    <w:multiLevelType w:val="hybridMultilevel"/>
+    <w:tmpl w:val="D2409F40"/>
+    <w:lvl w:ilvl="0" w:tplc="1C09000F">
+      <w:start w:val="1"/>
+      <w:numFmt w:val="decimal"/>
+      <w:lvlText w:val="%1."/>
+      <w:lvlJc w:val="left"/>
+      <w:pPr>
+        <w:ind w:left="720" w:hanging="360"/>
+      </w:pPr>
+    </w:lvl>
+    <w:lvl w:ilvl="1" w:tplc="1C090019" w:tentative="1">
+      <w:start w:val="1"/>
+      <w:numFmt w:val="lowerLetter"/>
+      <w:lvlText w:val="%2."/>
+      <w:lvlJc w:val="left"/>
+      <w:pPr>
+        <w:ind w:left="1440" w:hanging="360"/>
+      </w:pPr>
+    </w:lvl>
+    <w:lvl w:ilvl="2" w:tplc="1C09001B" w:tentative="1">
+      <w:start w:val="1"/>
+      <w:numFmt w:val="lowerRoman"/>
+      <w:lvlText w:val="%3."/>
+      <w:lvlJc w:val="right"/>
+      <w:pPr>
+        <w:ind w:left="2160" w:hanging="180"/>
+      </w:pPr>
+    </w:lvl>
+    <w:lvl w:ilvl="3" w:tplc="1C09000F" w:tentative="1">
+      <w:start w:val="1"/>
+      <w:numFmt w:val="decimal"/>
+      <w:lvlText w:val="%4."/>
+      <w:lvlJc w:val="left"/>
+      <w:pPr>
+        <w:ind w:left="2880" w:hanging="360"/>
+      </w:pPr>
+    </w:lvl>
+    <w:lvl w:ilvl="4" w:tplc="1C090019" w:tentative="1">
+      <w:start w:val="1"/>
+      <w:numFmt w:val="lowerLetter"/>
+      <w:lvlText w:val="%5."/>
+      <w:lvlJc w:val="left"/>
+      <w:pPr>
+        <w:ind w:left="3600" w:hanging="360"/>
+      </w:pPr>
+    </w:lvl>
+    <w:lvl w:ilvl="5" w:tplc="1C09001B" w:tentative="1">
+      <w:start w:val="1"/>
+      <w:numFmt w:val="lowerRoman"/>
+      <w:lvlText w:val="%6."/>
+      <w:lvlJc w:val="right"/>
+      <w:pPr>
+        <w:ind w:left="4320" w:hanging="180"/>
+      </w:pPr>
+    </w:lvl>
+    <w:lvl w:ilvl="6" w:tplc="1C09000F" w:tentative="1">
+      <w:start w:val="1"/>
+      <w:numFmt w:val="decimal"/>
+      <w:lvlText w:val="%7."/>
+      <w:lvlJc w:val="left"/>
+      <w:pPr>
+        <w:ind w:left="5040" w:hanging="360"/>
+      </w:pPr>
+    </w:lvl>
+    <w:lvl w:ilvl="7" w:tplc="1C090019" w:tentative="1">
+      <w:start w:val="1"/>
+      <w:numFmt w:val="lowerLetter"/>
+      <w:lvlText w:val="%8."/>
+      <w:lvlJc w:val="left"/>
+      <w:pPr>
+        <w:ind w:left="5760" w:hanging="360"/>
+      </w:pPr>
+    </w:lvl>
+    <w:lvl w:ilvl="8" w:tplc="1C09001B" w:tentative="1">
+      <w:start w:val="1"/>
+      <w:numFmt w:val="lowerRoman"/>
+      <w:lvlText w:val="%9."/>
+      <w:lvlJc w:val="right"/>
+      <w:pPr>
+        <w:ind w:left="6480" w:hanging="180"/>
+      </w:pPr>
+    </w:lvl>
+  </w:abstractNum>
+  <w:abstractNum w:abstractNumId="5" w15:restartNumberingAfterBreak="0">
     <w:nsid w:val="372830FB"/>
     <w:multiLevelType w:val="hybridMultilevel"/>
     <w:tmpl w:val="938ABDC6"/>
@@ -12821,7 +13779,7 @@
       </w:rPr>
     </w:lvl>
   </w:abstractNum>
-  <w:abstractNum w:abstractNumId="5" w15:restartNumberingAfterBreak="0">
+  <w:abstractNum w:abstractNumId="6" w15:restartNumberingAfterBreak="0">
     <w:nsid w:val="45840BFE"/>
     <w:multiLevelType w:val="hybridMultilevel"/>
     <w:tmpl w:val="6CA0A4B4"/>
@@ -12907,7 +13865,7 @@
       </w:pPr>
     </w:lvl>
   </w:abstractNum>
-  <w:abstractNum w:abstractNumId="6" w15:restartNumberingAfterBreak="0">
+  <w:abstractNum w:abstractNumId="7" w15:restartNumberingAfterBreak="0">
     <w:nsid w:val="459D4D5E"/>
     <w:multiLevelType w:val="hybridMultilevel"/>
     <w:tmpl w:val="CAAE1AFA"/>
@@ -12993,7 +13951,7 @@
       </w:pPr>
     </w:lvl>
   </w:abstractNum>
-  <w:abstractNum w:abstractNumId="7" w15:restartNumberingAfterBreak="0">
+  <w:abstractNum w:abstractNumId="8" w15:restartNumberingAfterBreak="0">
     <w:nsid w:val="4DF035E8"/>
     <w:multiLevelType w:val="hybridMultilevel"/>
     <w:tmpl w:val="88BE7C5A"/>
@@ -13084,7 +14042,7 @@
       </w:pPr>
     </w:lvl>
   </w:abstractNum>
-  <w:abstractNum w:abstractNumId="8" w15:restartNumberingAfterBreak="0">
+  <w:abstractNum w:abstractNumId="9" w15:restartNumberingAfterBreak="0">
     <w:nsid w:val="56083678"/>
     <w:multiLevelType w:val="hybridMultilevel"/>
     <w:tmpl w:val="D4F0A8E6"/>
@@ -13170,7 +14128,7 @@
       </w:pPr>
     </w:lvl>
   </w:abstractNum>
-  <w:abstractNum w:abstractNumId="9" w15:restartNumberingAfterBreak="0">
+  <w:abstractNum w:abstractNumId="10" w15:restartNumberingAfterBreak="0">
     <w:nsid w:val="5D234AFE"/>
     <w:multiLevelType w:val="hybridMultilevel"/>
     <w:tmpl w:val="95E037AA"/>
@@ -13259,7 +14217,93 @@
       </w:pPr>
     </w:lvl>
   </w:abstractNum>
-  <w:abstractNum w:abstractNumId="10" w15:restartNumberingAfterBreak="0">
+  <w:abstractNum w:abstractNumId="11" w15:restartNumberingAfterBreak="0">
+    <w:nsid w:val="5DAA06D6"/>
+    <w:multiLevelType w:val="hybridMultilevel"/>
+    <w:tmpl w:val="BC2430F2"/>
+    <w:lvl w:ilvl="0" w:tplc="1C09000F">
+      <w:start w:val="1"/>
+      <w:numFmt w:val="decimal"/>
+      <w:lvlText w:val="%1."/>
+      <w:lvlJc w:val="left"/>
+      <w:pPr>
+        <w:ind w:left="720" w:hanging="360"/>
+      </w:pPr>
+    </w:lvl>
+    <w:lvl w:ilvl="1" w:tplc="1C090019" w:tentative="1">
+      <w:start w:val="1"/>
+      <w:numFmt w:val="lowerLetter"/>
+      <w:lvlText w:val="%2."/>
+      <w:lvlJc w:val="left"/>
+      <w:pPr>
+        <w:ind w:left="1440" w:hanging="360"/>
+      </w:pPr>
+    </w:lvl>
+    <w:lvl w:ilvl="2" w:tplc="1C09001B" w:tentative="1">
+      <w:start w:val="1"/>
+      <w:numFmt w:val="lowerRoman"/>
+      <w:lvlText w:val="%3."/>
+      <w:lvlJc w:val="right"/>
+      <w:pPr>
+        <w:ind w:left="2160" w:hanging="180"/>
+      </w:pPr>
+    </w:lvl>
+    <w:lvl w:ilvl="3" w:tplc="1C09000F" w:tentative="1">
+      <w:start w:val="1"/>
+      <w:numFmt w:val="decimal"/>
+      <w:lvlText w:val="%4."/>
+      <w:lvlJc w:val="left"/>
+      <w:pPr>
+        <w:ind w:left="2880" w:hanging="360"/>
+      </w:pPr>
+    </w:lvl>
+    <w:lvl w:ilvl="4" w:tplc="1C090019" w:tentative="1">
+      <w:start w:val="1"/>
+      <w:numFmt w:val="lowerLetter"/>
+      <w:lvlText w:val="%5."/>
+      <w:lvlJc w:val="left"/>
+      <w:pPr>
+        <w:ind w:left="3600" w:hanging="360"/>
+      </w:pPr>
+    </w:lvl>
+    <w:lvl w:ilvl="5" w:tplc="1C09001B" w:tentative="1">
+      <w:start w:val="1"/>
+      <w:numFmt w:val="lowerRoman"/>
+      <w:lvlText w:val="%6."/>
+      <w:lvlJc w:val="right"/>
+      <w:pPr>
+        <w:ind w:left="4320" w:hanging="180"/>
+      </w:pPr>
+    </w:lvl>
+    <w:lvl w:ilvl="6" w:tplc="1C09000F" w:tentative="1">
+      <w:start w:val="1"/>
+      <w:numFmt w:val="decimal"/>
+      <w:lvlText w:val="%7."/>
+      <w:lvlJc w:val="left"/>
+      <w:pPr>
+        <w:ind w:left="5040" w:hanging="360"/>
+      </w:pPr>
+    </w:lvl>
+    <w:lvl w:ilvl="7" w:tplc="1C090019" w:tentative="1">
+      <w:start w:val="1"/>
+      <w:numFmt w:val="lowerLetter"/>
+      <w:lvlText w:val="%8."/>
+      <w:lvlJc w:val="left"/>
+      <w:pPr>
+        <w:ind w:left="5760" w:hanging="360"/>
+      </w:pPr>
+    </w:lvl>
+    <w:lvl w:ilvl="8" w:tplc="1C09001B" w:tentative="1">
+      <w:start w:val="1"/>
+      <w:numFmt w:val="lowerRoman"/>
+      <w:lvlText w:val="%9."/>
+      <w:lvlJc w:val="right"/>
+      <w:pPr>
+        <w:ind w:left="6480" w:hanging="180"/>
+      </w:pPr>
+    </w:lvl>
+  </w:abstractNum>
+  <w:abstractNum w:abstractNumId="12" w15:restartNumberingAfterBreak="0">
     <w:nsid w:val="5DC47F47"/>
     <w:multiLevelType w:val="hybridMultilevel"/>
     <w:tmpl w:val="2E864AEC"/>
@@ -13349,7 +14393,7 @@
       </w:pPr>
     </w:lvl>
   </w:abstractNum>
-  <w:abstractNum w:abstractNumId="11" w15:restartNumberingAfterBreak="0">
+  <w:abstractNum w:abstractNumId="13" w15:restartNumberingAfterBreak="0">
     <w:nsid w:val="5DEC0319"/>
     <w:multiLevelType w:val="hybridMultilevel"/>
     <w:tmpl w:val="C41E29EA"/>
@@ -13438,7 +14482,7 @@
       </w:pPr>
     </w:lvl>
   </w:abstractNum>
-  <w:abstractNum w:abstractNumId="12" w15:restartNumberingAfterBreak="0">
+  <w:abstractNum w:abstractNumId="14" w15:restartNumberingAfterBreak="0">
     <w:nsid w:val="62300E95"/>
     <w:multiLevelType w:val="hybridMultilevel"/>
     <w:tmpl w:val="307A3C3E"/>
@@ -13551,7 +14595,7 @@
       </w:rPr>
     </w:lvl>
   </w:abstractNum>
-  <w:abstractNum w:abstractNumId="13" w15:restartNumberingAfterBreak="0">
+  <w:abstractNum w:abstractNumId="15" w15:restartNumberingAfterBreak="0">
     <w:nsid w:val="73607137"/>
     <w:multiLevelType w:val="hybridMultilevel"/>
     <w:tmpl w:val="49A24B18"/>
@@ -13671,40 +14715,46 @@
     <w:abstractNumId w:val="1"/>
   </w:num>
   <w:num w:numId="3" w16cid:durableId="298800243">
+    <w:abstractNumId w:val="14"/>
+  </w:num>
+  <w:num w:numId="4" w16cid:durableId="611594820">
     <w:abstractNumId w:val="12"/>
   </w:num>
-  <w:num w:numId="4" w16cid:durableId="611594820">
+  <w:num w:numId="5" w16cid:durableId="1049187053">
+    <w:abstractNumId w:val="8"/>
+  </w:num>
+  <w:num w:numId="6" w16cid:durableId="1314800746">
+    <w:abstractNumId w:val="15"/>
+  </w:num>
+  <w:num w:numId="7" w16cid:durableId="1117019206">
+    <w:abstractNumId w:val="6"/>
+  </w:num>
+  <w:num w:numId="8" w16cid:durableId="1110468299">
+    <w:abstractNumId w:val="7"/>
+  </w:num>
+  <w:num w:numId="9" w16cid:durableId="346904853">
+    <w:abstractNumId w:val="9"/>
+  </w:num>
+  <w:num w:numId="10" w16cid:durableId="303849309">
     <w:abstractNumId w:val="10"/>
   </w:num>
-  <w:num w:numId="5" w16cid:durableId="1049187053">
-    <w:abstractNumId w:val="7"/>
-  </w:num>
-  <w:num w:numId="6" w16cid:durableId="1314800746">
-    <w:abstractNumId w:val="13"/>
-  </w:num>
-  <w:num w:numId="7" w16cid:durableId="1117019206">
+  <w:num w:numId="11" w16cid:durableId="1275746818">
     <w:abstractNumId w:val="5"/>
-  </w:num>
-  <w:num w:numId="8" w16cid:durableId="1110468299">
-    <w:abstractNumId w:val="6"/>
-  </w:num>
-  <w:num w:numId="9" w16cid:durableId="346904853">
-    <w:abstractNumId w:val="8"/>
-  </w:num>
-  <w:num w:numId="10" w16cid:durableId="303849309">
-    <w:abstractNumId w:val="9"/>
-  </w:num>
-  <w:num w:numId="11" w16cid:durableId="1275746818">
-    <w:abstractNumId w:val="4"/>
   </w:num>
   <w:num w:numId="12" w16cid:durableId="593976114">
     <w:abstractNumId w:val="0"/>
   </w:num>
   <w:num w:numId="13" w16cid:durableId="1805929515">
-    <w:abstractNumId w:val="11"/>
+    <w:abstractNumId w:val="13"/>
   </w:num>
   <w:num w:numId="14" w16cid:durableId="1446386783">
     <w:abstractNumId w:val="3"/>
+  </w:num>
+  <w:num w:numId="15" w16cid:durableId="1809592415">
+    <w:abstractNumId w:val="11"/>
+  </w:num>
+  <w:num w:numId="16" w16cid:durableId="339699309">
+    <w:abstractNumId w:val="4"/>
   </w:num>
 </w:numbering>
 </file>
@@ -14515,6 +15565,25 @@
       <w:lang w:eastAsia="en-ZA"/>
     </w:rPr>
   </w:style>
+  <w:style w:type="paragraph" w:styleId="Caption">
+    <w:name w:val="caption"/>
+    <w:basedOn w:val="Normal"/>
+    <w:next w:val="Normal"/>
+    <w:uiPriority w:val="35"/>
+    <w:unhideWhenUsed/>
+    <w:qFormat/>
+    <w:rsid w:val="00A81D50"/>
+    <w:pPr>
+      <w:spacing w:after="200"/>
+    </w:pPr>
+    <w:rPr>
+      <w:i/>
+      <w:iCs/>
+      <w:color w:val="44546A" w:themeColor="text2"/>
+      <w:sz w:val="18"/>
+      <w:szCs w:val="18"/>
+    </w:rPr>
+  </w:style>
 </w:styles>
 </file>
 
@@ -14814,6 +15883,17 @@
 </file>
 
 <file path=customXml/item1.xml><?xml version="1.0" encoding="utf-8"?>
+<p:properties xmlns:p="http://schemas.microsoft.com/office/2006/metadata/properties" xmlns:xsi="http://www.w3.org/2001/XMLSchema-instance" xmlns:pc="http://schemas.microsoft.com/office/infopath/2007/PartnerControls">
+  <documentManagement>
+    <lcf76f155ced4ddcb4097134ff3c332f xmlns="49b67118-50a5-4d3e-89b7-9848e8a6257b">
+      <Terms xmlns="http://schemas.microsoft.com/office/infopath/2007/PartnerControls"/>
+    </lcf76f155ced4ddcb4097134ff3c332f>
+    <TaxCatchAll xmlns="876e04ec-c44d-45fb-a45b-87644b3a9fdd" xsi:nil="true"/>
+  </documentManagement>
+</p:properties>
+</file>
+
+<file path=customXml/item2.xml><?xml version="1.0" encoding="utf-8"?>
 <?mso-contentType ?>
 <FormTemplates xmlns="http://schemas.microsoft.com/sharepoint/v3/contenttype/forms">
   <Display>DocumentLibraryForm</Display>
@@ -14822,7 +15902,7 @@
 </FormTemplates>
 </file>
 
-<file path=customXml/item2.xml><?xml version="1.0" encoding="utf-8"?>
+<file path=customXml/item3.xml><?xml version="1.0" encoding="utf-8"?>
 <ct:contentTypeSchema xmlns:ct="http://schemas.microsoft.com/office/2006/metadata/contentType" xmlns:ma="http://schemas.microsoft.com/office/2006/metadata/properties/metaAttributes" ct:_="" ma:_="" ma:contentTypeName="Document" ma:contentTypeID="0x010100663712DCE29D0945B25F4C5A40C282BF" ma:contentTypeVersion="12" ma:contentTypeDescription="Create a new document." ma:contentTypeScope="" ma:versionID="fcfa37499a7459845d01f12cf1c09b9b">
   <xsd:schema xmlns:xsd="http://www.w3.org/2001/XMLSchema" xmlns:xs="http://www.w3.org/2001/XMLSchema" xmlns:p="http://schemas.microsoft.com/office/2006/metadata/properties" xmlns:ns2="49b67118-50a5-4d3e-89b7-9848e8a6257b" xmlns:ns3="876e04ec-c44d-45fb-a45b-87644b3a9fdd" targetNamespace="http://schemas.microsoft.com/office/2006/metadata/properties" ma:root="true" ma:fieldsID="4a0dc762b5d20e9128f6e5959d8fc2f5" ns2:_="" ns3:_="">
     <xsd:import namespace="49b67118-50a5-4d3e-89b7-9848e8a6257b"/>
@@ -15017,22 +16097,22 @@
 </ct:contentTypeSchema>
 </file>
 
-<file path=customXml/item3.xml><?xml version="1.0" encoding="utf-8"?>
+<file path=customXml/item4.xml><?xml version="1.0" encoding="utf-8"?>
 <b:Sources xmlns:b="http://schemas.openxmlformats.org/officeDocument/2006/bibliography" xmlns="http://schemas.openxmlformats.org/officeDocument/2006/bibliography" SelectedStyle="\APASixthEditionOfficeOnline.xsl" StyleName="APA" Version="6"/>
 </file>
 
-<file path=customXml/item4.xml><?xml version="1.0" encoding="utf-8"?>
-<p:properties xmlns:p="http://schemas.microsoft.com/office/2006/metadata/properties" xmlns:xsi="http://www.w3.org/2001/XMLSchema-instance" xmlns:pc="http://schemas.microsoft.com/office/infopath/2007/PartnerControls">
-  <documentManagement>
-    <lcf76f155ced4ddcb4097134ff3c332f xmlns="49b67118-50a5-4d3e-89b7-9848e8a6257b">
-      <Terms xmlns="http://schemas.microsoft.com/office/infopath/2007/PartnerControls"/>
-    </lcf76f155ced4ddcb4097134ff3c332f>
-    <TaxCatchAll xmlns="876e04ec-c44d-45fb-a45b-87644b3a9fdd" xsi:nil="true"/>
-  </documentManagement>
-</p:properties>
+<file path=customXml/itemProps1.xml><?xml version="1.0" encoding="utf-8"?>
+<ds:datastoreItem xmlns:ds="http://schemas.openxmlformats.org/officeDocument/2006/customXml" ds:itemID="{F0FA16F4-B3B5-4912-B9B6-0EFF6DB2AB2E}">
+  <ds:schemaRefs>
+    <ds:schemaRef ds:uri="http://schemas.microsoft.com/office/2006/metadata/properties"/>
+    <ds:schemaRef ds:uri="http://schemas.microsoft.com/office/infopath/2007/PartnerControls"/>
+    <ds:schemaRef ds:uri="49b67118-50a5-4d3e-89b7-9848e8a6257b"/>
+    <ds:schemaRef ds:uri="876e04ec-c44d-45fb-a45b-87644b3a9fdd"/>
+  </ds:schemaRefs>
+</ds:datastoreItem>
 </file>
 
-<file path=customXml/itemProps1.xml><?xml version="1.0" encoding="utf-8"?>
+<file path=customXml/itemProps2.xml><?xml version="1.0" encoding="utf-8"?>
 <ds:datastoreItem xmlns:ds="http://schemas.openxmlformats.org/officeDocument/2006/customXml" ds:itemID="{A0C1A221-436E-42DA-97DA-47502C48A139}">
   <ds:schemaRefs>
     <ds:schemaRef ds:uri="http://schemas.microsoft.com/sharepoint/v3/contenttype/forms"/>
@@ -15040,7 +16120,7 @@
 </ds:datastoreItem>
 </file>
 
-<file path=customXml/itemProps2.xml><?xml version="1.0" encoding="utf-8"?>
+<file path=customXml/itemProps3.xml><?xml version="1.0" encoding="utf-8"?>
 <ds:datastoreItem xmlns:ds="http://schemas.openxmlformats.org/officeDocument/2006/customXml" ds:itemID="{EE464A99-880F-4ABD-8281-73BDBD33F722}">
   <ds:schemaRefs>
     <ds:schemaRef ds:uri="http://schemas.microsoft.com/office/2006/metadata/contentType"/>
@@ -15059,21 +16139,10 @@
 </ds:datastoreItem>
 </file>
 
-<file path=customXml/itemProps3.xml><?xml version="1.0" encoding="utf-8"?>
+<file path=customXml/itemProps4.xml><?xml version="1.0" encoding="utf-8"?>
 <ds:datastoreItem xmlns:ds="http://schemas.openxmlformats.org/officeDocument/2006/customXml" ds:itemID="{35695F99-B626-4191-B469-724B0EB6D6EA}">
   <ds:schemaRefs>
     <ds:schemaRef ds:uri="http://schemas.openxmlformats.org/officeDocument/2006/bibliography"/>
   </ds:schemaRefs>
 </ds:datastoreItem>
-</file>
-
-<file path=customXml/itemProps4.xml><?xml version="1.0" encoding="utf-8"?>
-<ds:datastoreItem xmlns:ds="http://schemas.openxmlformats.org/officeDocument/2006/customXml" ds:itemID="{F0FA16F4-B3B5-4912-B9B6-0EFF6DB2AB2E}">
-  <ds:schemaRefs>
-    <ds:schemaRef ds:uri="http://schemas.microsoft.com/office/2006/metadata/properties"/>
-    <ds:schemaRef ds:uri="http://schemas.microsoft.com/office/infopath/2007/PartnerControls"/>
-    <ds:schemaRef ds:uri="49b67118-50a5-4d3e-89b7-9848e8a6257b"/>
-    <ds:schemaRef ds:uri="876e04ec-c44d-45fb-a45b-87644b3a9fdd"/>
-  </ds:schemaRefs>
-</ds:datastoreItem>
 </file>
</xml_diff>